<commit_message>
PDF Styling and Structure
</commit_message>
<xml_diff>
--- a/Final PDF.docx
+++ b/Final PDF.docx
@@ -25,6 +25,137 @@
       </w:pPr>
       <w:r>
         <w:t>u25138309 – Christian Nunes</w:t>
+      </w:r>
+    </w:p>
+    <w:p>
+      <w:pPr>
+        <w:pStyle w:val="ListParagraph"/>
+        <w:numPr>
+          <w:ilvl w:val="0"/>
+          <w:numId w:val="1"/>
+        </w:numPr>
+      </w:pPr>
+    </w:p>
+    <w:p/>
+    <w:p>
+      <w:pPr>
+        <w:pStyle w:val="Heading1"/>
+      </w:pPr>
+      <w:r>
+        <w:t>Question 1</w:t>
+      </w:r>
+    </w:p>
+    <w:p>
+      <w:r>
+        <w:t>1.1)</w:t>
+      </w:r>
+    </w:p>
+    <w:p>
+      <w:r>
+        <w:t>1.2)</w:t>
+      </w:r>
+    </w:p>
+    <w:p>
+      <w:r>
+        <w:t>1.3)</w:t>
+      </w:r>
+    </w:p>
+    <w:p>
+      <w:r>
+        <w:t>1.4)</w:t>
+      </w:r>
+    </w:p>
+    <w:p>
+      <w:r>
+        <w:t>1.5)</w:t>
+      </w:r>
+    </w:p>
+    <w:p/>
+    <w:p>
+      <w:pPr>
+        <w:pStyle w:val="Heading1"/>
+      </w:pPr>
+      <w:r>
+        <w:t>Question 2</w:t>
+      </w:r>
+    </w:p>
+    <w:p>
+      <w:r>
+        <w:t>2.1)</w:t>
+      </w:r>
+    </w:p>
+    <w:p>
+      <w:r>
+        <w:t>2.2)</w:t>
+      </w:r>
+    </w:p>
+    <w:p>
+      <w:r>
+        <w:t>2.3)</w:t>
+      </w:r>
+    </w:p>
+    <w:p/>
+    <w:p>
+      <w:pPr>
+        <w:pStyle w:val="Heading1"/>
+      </w:pPr>
+      <w:r>
+        <w:t>Question 3</w:t>
+      </w:r>
+    </w:p>
+    <w:p>
+      <w:r>
+        <w:t>3.3)</w:t>
+      </w:r>
+    </w:p>
+    <w:p>
+      <w:pPr>
+        <w:pStyle w:val="Heading1"/>
+      </w:pPr>
+    </w:p>
+    <w:p>
+      <w:pPr>
+        <w:pStyle w:val="Heading1"/>
+      </w:pPr>
+      <w:r>
+        <w:t>Question 4</w:t>
+      </w:r>
+    </w:p>
+    <w:p>
+      <w:r>
+        <w:t>4.3</w:t>
+      </w:r>
+      <w:r>
+        <w:t>)</w:t>
+      </w:r>
+    </w:p>
+    <w:p/>
+    <w:p>
+      <w:pPr>
+        <w:pStyle w:val="Heading1"/>
+      </w:pPr>
+      <w:r>
+        <w:lastRenderedPageBreak/>
+        <w:t>Question 5</w:t>
+      </w:r>
+    </w:p>
+    <w:p>
+      <w:r>
+        <w:t>5.2)</w:t>
+      </w:r>
+    </w:p>
+    <w:p/>
+    <w:p>
+      <w:pPr>
+        <w:pStyle w:val="Heading1"/>
+      </w:pPr>
+      <w:r>
+        <w:t>Question 6</w:t>
+      </w:r>
+    </w:p>
+    <w:p>
+      <w:r>
+        <w:t>6.2)</w:t>
       </w:r>
     </w:p>
     <w:sectPr>

</xml_diff>

<commit_message>
Finished Task 2.2 and 2.3
</commit_message>
<xml_diff>
--- a/Final PDF.docx
+++ b/Final PDF.docx
@@ -35,6 +35,9 @@
           <w:numId w:val="1"/>
         </w:numPr>
       </w:pPr>
+      <w:r>
+        <w:t>u24742512 – Thabo Ngwabi</w:t>
+      </w:r>
     </w:p>
     <w:p/>
     <w:p>
@@ -91,8 +94,522 @@
     </w:p>
     <w:p>
       <w:r>
+        <w:t>Composite:</w:t>
+      </w:r>
+    </w:p>
+    <w:p>
+      <w:pPr>
+        <w:pStyle w:val="ListParagraph"/>
+        <w:numPr>
+          <w:ilvl w:val="0"/>
+          <w:numId w:val="2"/>
+        </w:numPr>
+      </w:pPr>
+      <w:r>
+        <w:t xml:space="preserve">Component: </w:t>
+      </w:r>
+      <w:proofErr w:type="spellStart"/>
+      <w:r>
+        <w:t>MapComponent</w:t>
+      </w:r>
+      <w:proofErr w:type="spellEnd"/>
+    </w:p>
+    <w:p>
+      <w:pPr>
+        <w:pStyle w:val="ListParagraph"/>
+        <w:numPr>
+          <w:ilvl w:val="0"/>
+          <w:numId w:val="2"/>
+        </w:numPr>
+      </w:pPr>
+      <w:r>
+        <w:t>Composite: Region</w:t>
+      </w:r>
+    </w:p>
+    <w:p>
+      <w:pPr>
+        <w:pStyle w:val="ListParagraph"/>
+        <w:numPr>
+          <w:ilvl w:val="0"/>
+          <w:numId w:val="2"/>
+        </w:numPr>
+      </w:pPr>
+      <w:r>
+        <w:t>Leaf: Location</w:t>
+      </w:r>
+    </w:p>
+    <w:p>
+      <w:r>
+        <w:t>Decorator:</w:t>
+      </w:r>
+    </w:p>
+    <w:p>
+      <w:pPr>
+        <w:pStyle w:val="ListParagraph"/>
+        <w:numPr>
+          <w:ilvl w:val="0"/>
+          <w:numId w:val="3"/>
+        </w:numPr>
+      </w:pPr>
+      <w:r>
+        <w:t xml:space="preserve">Component: </w:t>
+      </w:r>
+      <w:proofErr w:type="spellStart"/>
+      <w:r>
+        <w:t>MapComponent</w:t>
+      </w:r>
+      <w:proofErr w:type="spellEnd"/>
+    </w:p>
+    <w:p>
+      <w:pPr>
+        <w:pStyle w:val="ListParagraph"/>
+        <w:numPr>
+          <w:ilvl w:val="0"/>
+          <w:numId w:val="3"/>
+        </w:numPr>
+      </w:pPr>
+      <w:proofErr w:type="spellStart"/>
+      <w:r>
+        <w:t>ConcreteComponent</w:t>
+      </w:r>
+      <w:proofErr w:type="spellEnd"/>
+      <w:r>
+        <w:t>: Location</w:t>
+      </w:r>
+    </w:p>
+    <w:p>
+      <w:pPr>
+        <w:pStyle w:val="ListParagraph"/>
+        <w:numPr>
+          <w:ilvl w:val="0"/>
+          <w:numId w:val="3"/>
+        </w:numPr>
+      </w:pPr>
+      <w:r>
+        <w:t>Decorator: Decorator</w:t>
+      </w:r>
+    </w:p>
+    <w:p>
+      <w:pPr>
+        <w:pStyle w:val="ListParagraph"/>
+        <w:numPr>
+          <w:ilvl w:val="0"/>
+          <w:numId w:val="3"/>
+        </w:numPr>
+      </w:pPr>
+      <w:proofErr w:type="spellStart"/>
+      <w:r>
+        <w:t>ConcreteDecorator</w:t>
+      </w:r>
+      <w:proofErr w:type="spellEnd"/>
+      <w:r>
+        <w:t xml:space="preserve">: </w:t>
+      </w:r>
+      <w:proofErr w:type="spellStart"/>
+      <w:r>
+        <w:t>WeatherDecorator</w:t>
+      </w:r>
+      <w:proofErr w:type="spellEnd"/>
+      <w:r>
+        <w:t xml:space="preserve">, </w:t>
+      </w:r>
+      <w:proofErr w:type="spellStart"/>
+      <w:r>
+        <w:t>TerrainDecorator</w:t>
+      </w:r>
+      <w:proofErr w:type="spellEnd"/>
+      <w:r>
+        <w:t xml:space="preserve">, </w:t>
+      </w:r>
+      <w:proofErr w:type="spellStart"/>
+      <w:r>
+        <w:t>TollDecorator</w:t>
+      </w:r>
+      <w:proofErr w:type="spellEnd"/>
+    </w:p>
+    <w:p>
+      <w:r>
+        <w:t xml:space="preserve">Strategy: </w:t>
+      </w:r>
+    </w:p>
+    <w:p>
+      <w:pPr>
+        <w:pStyle w:val="ListParagraph"/>
+        <w:numPr>
+          <w:ilvl w:val="0"/>
+          <w:numId w:val="4"/>
+        </w:numPr>
+      </w:pPr>
+      <w:r>
+        <w:t>Context: Trip</w:t>
+      </w:r>
+    </w:p>
+    <w:p>
+      <w:pPr>
+        <w:pStyle w:val="ListParagraph"/>
+        <w:numPr>
+          <w:ilvl w:val="0"/>
+          <w:numId w:val="4"/>
+        </w:numPr>
+      </w:pPr>
+      <w:r>
+        <w:t xml:space="preserve">Strategy: </w:t>
+      </w:r>
+      <w:proofErr w:type="spellStart"/>
+      <w:r>
+        <w:t>RouteStrategy</w:t>
+      </w:r>
+      <w:proofErr w:type="spellEnd"/>
+    </w:p>
+    <w:p>
+      <w:pPr>
+        <w:pStyle w:val="ListParagraph"/>
+        <w:numPr>
+          <w:ilvl w:val="0"/>
+          <w:numId w:val="4"/>
+        </w:numPr>
+      </w:pPr>
+      <w:proofErr w:type="spellStart"/>
+      <w:r>
+        <w:lastRenderedPageBreak/>
+        <w:t>ConcreteStrategies</w:t>
+      </w:r>
+      <w:proofErr w:type="spellEnd"/>
+      <w:r>
+        <w:t xml:space="preserve">: </w:t>
+      </w:r>
+      <w:proofErr w:type="spellStart"/>
+      <w:r>
+        <w:t>ShortestRouteStrategy</w:t>
+      </w:r>
+      <w:proofErr w:type="spellEnd"/>
+      <w:r>
+        <w:t xml:space="preserve">, </w:t>
+      </w:r>
+      <w:proofErr w:type="spellStart"/>
+      <w:r>
+        <w:t>FastestRouteStrategy</w:t>
+      </w:r>
+      <w:proofErr w:type="spellEnd"/>
+      <w:r>
+        <w:t xml:space="preserve">, </w:t>
+      </w:r>
+      <w:proofErr w:type="spellStart"/>
+      <w:r>
+        <w:t>ScenicStrategy</w:t>
+      </w:r>
+      <w:proofErr w:type="spellEnd"/>
+    </w:p>
+    <w:p>
+      <w:proofErr w:type="spellStart"/>
+      <w:r>
+        <w:t>AbstractFactory</w:t>
+      </w:r>
+      <w:proofErr w:type="spellEnd"/>
+    </w:p>
+    <w:p>
+      <w:pPr>
+        <w:pStyle w:val="ListParagraph"/>
+        <w:numPr>
+          <w:ilvl w:val="0"/>
+          <w:numId w:val="5"/>
+        </w:numPr>
+      </w:pPr>
+      <w:proofErr w:type="spellStart"/>
+      <w:r>
+        <w:t>AbstractFactory</w:t>
+      </w:r>
+      <w:proofErr w:type="spellEnd"/>
+      <w:r>
+        <w:t xml:space="preserve">: </w:t>
+      </w:r>
+      <w:proofErr w:type="spellStart"/>
+      <w:r>
+        <w:t>WorldFactory</w:t>
+      </w:r>
+      <w:proofErr w:type="spellEnd"/>
+    </w:p>
+    <w:p>
+      <w:pPr>
+        <w:pStyle w:val="ListParagraph"/>
+        <w:numPr>
+          <w:ilvl w:val="0"/>
+          <w:numId w:val="5"/>
+        </w:numPr>
+      </w:pPr>
+      <w:proofErr w:type="spellStart"/>
+      <w:r>
+        <w:t>ConcreteFactories</w:t>
+      </w:r>
+      <w:proofErr w:type="spellEnd"/>
+      <w:r>
+        <w:t xml:space="preserve">: </w:t>
+      </w:r>
+      <w:proofErr w:type="spellStart"/>
+      <w:r>
+        <w:t>DesertFactory</w:t>
+      </w:r>
+      <w:proofErr w:type="spellEnd"/>
+      <w:r>
+        <w:t xml:space="preserve">, </w:t>
+      </w:r>
+      <w:proofErr w:type="spellStart"/>
+      <w:r>
+        <w:t>SwampFactory</w:t>
+      </w:r>
+      <w:proofErr w:type="spellEnd"/>
+    </w:p>
+    <w:p>
+      <w:pPr>
+        <w:pStyle w:val="ListParagraph"/>
+        <w:numPr>
+          <w:ilvl w:val="0"/>
+          <w:numId w:val="5"/>
+        </w:numPr>
+      </w:pPr>
+      <w:proofErr w:type="spellStart"/>
+      <w:r>
+        <w:t>AbstractProducts</w:t>
+      </w:r>
+      <w:proofErr w:type="spellEnd"/>
+      <w:r>
+        <w:t xml:space="preserve">: </w:t>
+      </w:r>
+      <w:proofErr w:type="spellStart"/>
+      <w:r>
+        <w:t>AbstractNPC</w:t>
+      </w:r>
+      <w:proofErr w:type="spellEnd"/>
+      <w:r>
+        <w:t xml:space="preserve">, </w:t>
+      </w:r>
+      <w:proofErr w:type="spellStart"/>
+      <w:r>
+        <w:t>AbstractTerrain</w:t>
+      </w:r>
+      <w:proofErr w:type="spellEnd"/>
+      <w:r>
+        <w:t xml:space="preserve">, </w:t>
+      </w:r>
+      <w:proofErr w:type="spellStart"/>
+      <w:r>
+        <w:t>AbstractObstacle</w:t>
+      </w:r>
+      <w:proofErr w:type="spellEnd"/>
+    </w:p>
+    <w:p>
+      <w:r>
+        <w:t>State:</w:t>
+      </w:r>
+    </w:p>
+    <w:p>
+      <w:pPr>
+        <w:pStyle w:val="ListParagraph"/>
+        <w:numPr>
+          <w:ilvl w:val="0"/>
+          <w:numId w:val="6"/>
+        </w:numPr>
+      </w:pPr>
+      <w:r>
+        <w:t>Context: Traveler</w:t>
+      </w:r>
+    </w:p>
+    <w:p>
+      <w:pPr>
+        <w:pStyle w:val="ListParagraph"/>
+        <w:numPr>
+          <w:ilvl w:val="0"/>
+          <w:numId w:val="6"/>
+        </w:numPr>
+      </w:pPr>
+      <w:r>
+        <w:t xml:space="preserve">State: </w:t>
+      </w:r>
+      <w:proofErr w:type="spellStart"/>
+      <w:r>
+        <w:t>TravelMode</w:t>
+      </w:r>
+      <w:proofErr w:type="spellEnd"/>
+    </w:p>
+    <w:p>
+      <w:pPr>
+        <w:pStyle w:val="ListParagraph"/>
+        <w:numPr>
+          <w:ilvl w:val="0"/>
+          <w:numId w:val="6"/>
+        </w:numPr>
+      </w:pPr>
+      <w:proofErr w:type="spellStart"/>
+      <w:r>
+        <w:t>ConcreteStates</w:t>
+      </w:r>
+      <w:proofErr w:type="spellEnd"/>
+      <w:r>
+        <w:t xml:space="preserve">: </w:t>
+      </w:r>
+      <w:proofErr w:type="spellStart"/>
+      <w:r>
+        <w:t>WalkingMode</w:t>
+      </w:r>
+      <w:proofErr w:type="spellEnd"/>
+      <w:r>
+        <w:t xml:space="preserve">, </w:t>
+      </w:r>
+      <w:proofErr w:type="spellStart"/>
+      <w:r>
+        <w:t>DrivingMode</w:t>
+      </w:r>
+      <w:proofErr w:type="spellEnd"/>
+      <w:r>
+        <w:t xml:space="preserve">, </w:t>
+      </w:r>
+      <w:proofErr w:type="spellStart"/>
+      <w:r>
+        <w:t>FlyingMode</w:t>
+      </w:r>
+      <w:proofErr w:type="spellEnd"/>
+      <w:r>
+        <w:t xml:space="preserve">, </w:t>
+      </w:r>
+      <w:proofErr w:type="spellStart"/>
+      <w:r>
+        <w:t>SwimmingMode</w:t>
+      </w:r>
+      <w:proofErr w:type="spellEnd"/>
+    </w:p>
+    <w:p>
+      <w:pPr>
+        <w:rPr>
+          <w:u w:val="single"/>
+        </w:rPr>
+      </w:pPr>
+      <w:r>
+        <w:rPr>
+          <w:u w:val="single"/>
+        </w:rPr>
+        <w:t>Abstraction/Ownership Design Justification</w:t>
+      </w:r>
+    </w:p>
+    <w:p>
+      <w:pPr>
+        <w:pStyle w:val="ListParagraph"/>
+        <w:numPr>
+          <w:ilvl w:val="0"/>
+          <w:numId w:val="7"/>
+        </w:numPr>
+      </w:pPr>
+      <w:r>
+        <w:t xml:space="preserve">Region and </w:t>
+      </w:r>
+      <w:proofErr w:type="spellStart"/>
+      <w:r>
+        <w:t>MapComponent</w:t>
+      </w:r>
+      <w:proofErr w:type="spellEnd"/>
+      <w:r>
+        <w:t>, a composition association was used because when one region is deleted, all it’s other regions/locations down the tree hierarchy chain must be deleted as well</w:t>
+      </w:r>
+    </w:p>
+    <w:p>
+      <w:r>
         <w:t>2.3)</w:t>
       </w:r>
+      <w:r>
+        <w:t xml:space="preserve"> </w:t>
+      </w:r>
+    </w:p>
+    <w:p>
+      <w:r>
+        <w:t>Addition 1: A new biome (Abstract Factory)</w:t>
+      </w:r>
+    </w:p>
+    <w:p>
+      <w:pPr>
+        <w:pStyle w:val="ListParagraph"/>
+        <w:numPr>
+          <w:ilvl w:val="0"/>
+          <w:numId w:val="7"/>
+        </w:numPr>
+      </w:pPr>
+      <w:r>
+        <w:t xml:space="preserve">Created </w:t>
+      </w:r>
+      <w:proofErr w:type="spellStart"/>
+      <w:r>
+        <w:t>VolcanoFactory</w:t>
+      </w:r>
+      <w:proofErr w:type="spellEnd"/>
+      <w:r>
+        <w:t xml:space="preserve"> which creates </w:t>
+      </w:r>
+      <w:proofErr w:type="spellStart"/>
+      <w:r>
+        <w:t>VolcanicNPC</w:t>
+      </w:r>
+      <w:proofErr w:type="spellEnd"/>
+      <w:r>
+        <w:t xml:space="preserve">, </w:t>
+      </w:r>
+      <w:proofErr w:type="spellStart"/>
+      <w:r>
+        <w:t>VolcanicTerrain</w:t>
+      </w:r>
+      <w:proofErr w:type="spellEnd"/>
+      <w:r>
+        <w:t xml:space="preserve">, </w:t>
+      </w:r>
+      <w:proofErr w:type="spellStart"/>
+      <w:r>
+        <w:t>VolcanicObstacle</w:t>
+      </w:r>
+      <w:proofErr w:type="spellEnd"/>
+    </w:p>
+    <w:p>
+      <w:r>
+        <w:t>Addition 2: A new environment decorator (Decorator)</w:t>
+      </w:r>
+    </w:p>
+    <w:p>
+      <w:pPr>
+        <w:pStyle w:val="ListParagraph"/>
+        <w:numPr>
+          <w:ilvl w:val="0"/>
+          <w:numId w:val="7"/>
+        </w:numPr>
+      </w:pPr>
+      <w:r>
+        <w:t xml:space="preserve">Created </w:t>
+      </w:r>
+      <w:proofErr w:type="spellStart"/>
+      <w:r>
+        <w:t>RadiationDecorator</w:t>
+      </w:r>
+      <w:proofErr w:type="spellEnd"/>
+      <w:r>
+        <w:t xml:space="preserve"> which would add massive travel cost penalties</w:t>
+      </w:r>
+    </w:p>
+    <w:p>
+      <w:r>
+        <w:t xml:space="preserve">Addition 3: </w:t>
+      </w:r>
+      <w:proofErr w:type="spellStart"/>
+      <w:r>
+        <w:t>TeleportationMode</w:t>
+      </w:r>
+      <w:proofErr w:type="spellEnd"/>
+    </w:p>
+    <w:p>
+      <w:pPr>
+        <w:pStyle w:val="ListParagraph"/>
+        <w:numPr>
+          <w:ilvl w:val="0"/>
+          <w:numId w:val="7"/>
+        </w:numPr>
+      </w:pPr>
+      <w:r>
+        <w:t>Added a fast travel teleportation mode</w:t>
+      </w:r>
     </w:p>
     <w:p/>
     <w:p>
@@ -135,7 +652,6 @@
         <w:pStyle w:val="Heading1"/>
       </w:pPr>
       <w:r>
-        <w:lastRenderedPageBreak/>
         <w:t>Question 5</w:t>
       </w:r>
     </w:p>
@@ -171,6 +687,345 @@
 <file path=word/numbering.xml><?xml version="1.0" encoding="utf-8"?>
 <w:numbering xmlns:wpc="http://schemas.microsoft.com/office/word/2010/wordprocessingCanvas" xmlns:cx="http://schemas.microsoft.com/office/drawing/2014/chartex" xmlns:cx1="http://schemas.microsoft.com/office/drawing/2015/9/8/chartex" xmlns:cx2="http://schemas.microsoft.com/office/drawing/2015/10/21/chartex" xmlns:cx3="http://schemas.microsoft.com/office/drawing/2016/5/9/chartex" xmlns:cx4="http://schemas.microsoft.com/office/drawing/2016/5/10/chartex" xmlns:cx5="http://schemas.microsoft.com/office/drawing/2016/5/11/chartex" xmlns:cx6="http://schemas.microsoft.com/office/drawing/2016/5/12/chartex" xmlns:cx7="http://schemas.microsoft.com/office/drawing/2016/5/13/chartex" xmlns:cx8="http://schemas.microsoft.com/office/drawing/2016/5/14/chartex" xmlns:mc="http://schemas.openxmlformats.org/markup-compatibility/2006" xmlns:aink="http://schemas.microsoft.com/office/drawing/2016/ink" xmlns:am3d="http://schemas.microsoft.com/office/drawing/2017/model3d" xmlns:o="urn:schemas-microsoft-com:office:office" xmlns:oel="http://schemas.microsoft.com/office/2019/extlst" xmlns:r="http://schemas.openxmlformats.org/officeDocument/2006/relationships" xmlns:m="http://schemas.openxmlformats.org/officeDocument/2006/math" xmlns:v="urn:schemas-microsoft-com:vml" xmlns:wp14="http://schemas.microsoft.com/office/word/2010/wordprocessingDrawing" xmlns:wp="http://schemas.openxmlformats.org/drawingml/2006/wordprocessingDrawing" xmlns:w10="urn:schemas-microsoft-com:office:word" xmlns:w="http://schemas.openxmlformats.org/wordprocessingml/2006/main" xmlns:w14="http://schemas.microsoft.com/office/word/2010/wordml" xmlns:w15="http://schemas.microsoft.com/office/word/2012/wordml" xmlns:w16cex="http://schemas.microsoft.com/office/word/2018/wordml/cex" xmlns:w16cid="http://schemas.microsoft.com/office/word/2016/wordml/cid" xmlns:w16="http://schemas.microsoft.com/office/word/2018/wordml" xmlns:w16du="http://schemas.microsoft.com/office/word/2023/wordml/word16du" xmlns:w16sdtdh="http://schemas.microsoft.com/office/word/2020/wordml/sdtdatahash" xmlns:w16sdtfl="http://schemas.microsoft.com/office/word/2024/wordml/sdtformatlock" xmlns:w16se="http://schemas.microsoft.com/office/word/2015/wordml/symex" xmlns:wpg="http://schemas.microsoft.com/office/word/2010/wordprocessingGroup" xmlns:wpi="http://schemas.microsoft.com/office/word/2010/wordprocessingInk" xmlns:wne="http://schemas.microsoft.com/office/word/2006/wordml" xmlns:wps="http://schemas.microsoft.com/office/word/2010/wordprocessingShape" mc:Ignorable="w14 w15 w16se w16cid w16 w16cex w16sdtdh w16sdtfl w16du wp14">
   <w:abstractNum w:abstractNumId="0" w15:restartNumberingAfterBreak="0">
+    <w:nsid w:val="022C0A98"/>
+    <w:multiLevelType w:val="hybridMultilevel"/>
+    <w:tmpl w:val="2FA66CA4"/>
+    <w:lvl w:ilvl="0" w:tplc="1C090001">
+      <w:start w:val="1"/>
+      <w:numFmt w:val="bullet"/>
+      <w:lvlText w:val=""/>
+      <w:lvlJc w:val="left"/>
+      <w:pPr>
+        <w:ind w:left="720" w:hanging="360"/>
+      </w:pPr>
+      <w:rPr>
+        <w:rFonts w:ascii="Symbol" w:hAnsi="Symbol" w:hint="default"/>
+      </w:rPr>
+    </w:lvl>
+    <w:lvl w:ilvl="1" w:tplc="1C090003" w:tentative="1">
+      <w:start w:val="1"/>
+      <w:numFmt w:val="bullet"/>
+      <w:lvlText w:val="o"/>
+      <w:lvlJc w:val="left"/>
+      <w:pPr>
+        <w:ind w:left="1440" w:hanging="360"/>
+      </w:pPr>
+      <w:rPr>
+        <w:rFonts w:ascii="Courier New" w:hAnsi="Courier New" w:cs="Courier New" w:hint="default"/>
+      </w:rPr>
+    </w:lvl>
+    <w:lvl w:ilvl="2" w:tplc="1C090005" w:tentative="1">
+      <w:start w:val="1"/>
+      <w:numFmt w:val="bullet"/>
+      <w:lvlText w:val=""/>
+      <w:lvlJc w:val="left"/>
+      <w:pPr>
+        <w:ind w:left="2160" w:hanging="360"/>
+      </w:pPr>
+      <w:rPr>
+        <w:rFonts w:ascii="Wingdings" w:hAnsi="Wingdings" w:hint="default"/>
+      </w:rPr>
+    </w:lvl>
+    <w:lvl w:ilvl="3" w:tplc="1C090001" w:tentative="1">
+      <w:start w:val="1"/>
+      <w:numFmt w:val="bullet"/>
+      <w:lvlText w:val=""/>
+      <w:lvlJc w:val="left"/>
+      <w:pPr>
+        <w:ind w:left="2880" w:hanging="360"/>
+      </w:pPr>
+      <w:rPr>
+        <w:rFonts w:ascii="Symbol" w:hAnsi="Symbol" w:hint="default"/>
+      </w:rPr>
+    </w:lvl>
+    <w:lvl w:ilvl="4" w:tplc="1C090003" w:tentative="1">
+      <w:start w:val="1"/>
+      <w:numFmt w:val="bullet"/>
+      <w:lvlText w:val="o"/>
+      <w:lvlJc w:val="left"/>
+      <w:pPr>
+        <w:ind w:left="3600" w:hanging="360"/>
+      </w:pPr>
+      <w:rPr>
+        <w:rFonts w:ascii="Courier New" w:hAnsi="Courier New" w:cs="Courier New" w:hint="default"/>
+      </w:rPr>
+    </w:lvl>
+    <w:lvl w:ilvl="5" w:tplc="1C090005" w:tentative="1">
+      <w:start w:val="1"/>
+      <w:numFmt w:val="bullet"/>
+      <w:lvlText w:val=""/>
+      <w:lvlJc w:val="left"/>
+      <w:pPr>
+        <w:ind w:left="4320" w:hanging="360"/>
+      </w:pPr>
+      <w:rPr>
+        <w:rFonts w:ascii="Wingdings" w:hAnsi="Wingdings" w:hint="default"/>
+      </w:rPr>
+    </w:lvl>
+    <w:lvl w:ilvl="6" w:tplc="1C090001" w:tentative="1">
+      <w:start w:val="1"/>
+      <w:numFmt w:val="bullet"/>
+      <w:lvlText w:val=""/>
+      <w:lvlJc w:val="left"/>
+      <w:pPr>
+        <w:ind w:left="5040" w:hanging="360"/>
+      </w:pPr>
+      <w:rPr>
+        <w:rFonts w:ascii="Symbol" w:hAnsi="Symbol" w:hint="default"/>
+      </w:rPr>
+    </w:lvl>
+    <w:lvl w:ilvl="7" w:tplc="1C090003" w:tentative="1">
+      <w:start w:val="1"/>
+      <w:numFmt w:val="bullet"/>
+      <w:lvlText w:val="o"/>
+      <w:lvlJc w:val="left"/>
+      <w:pPr>
+        <w:ind w:left="5760" w:hanging="360"/>
+      </w:pPr>
+      <w:rPr>
+        <w:rFonts w:ascii="Courier New" w:hAnsi="Courier New" w:cs="Courier New" w:hint="default"/>
+      </w:rPr>
+    </w:lvl>
+    <w:lvl w:ilvl="8" w:tplc="1C090005" w:tentative="1">
+      <w:start w:val="1"/>
+      <w:numFmt w:val="bullet"/>
+      <w:lvlText w:val=""/>
+      <w:lvlJc w:val="left"/>
+      <w:pPr>
+        <w:ind w:left="6480" w:hanging="360"/>
+      </w:pPr>
+      <w:rPr>
+        <w:rFonts w:ascii="Wingdings" w:hAnsi="Wingdings" w:hint="default"/>
+      </w:rPr>
+    </w:lvl>
+  </w:abstractNum>
+  <w:abstractNum w:abstractNumId="1" w15:restartNumberingAfterBreak="0">
+    <w:nsid w:val="0DFB0481"/>
+    <w:multiLevelType w:val="hybridMultilevel"/>
+    <w:tmpl w:val="0C5EC3F2"/>
+    <w:lvl w:ilvl="0" w:tplc="1C090001">
+      <w:start w:val="1"/>
+      <w:numFmt w:val="bullet"/>
+      <w:lvlText w:val=""/>
+      <w:lvlJc w:val="left"/>
+      <w:pPr>
+        <w:ind w:left="720" w:hanging="360"/>
+      </w:pPr>
+      <w:rPr>
+        <w:rFonts w:ascii="Symbol" w:hAnsi="Symbol" w:hint="default"/>
+      </w:rPr>
+    </w:lvl>
+    <w:lvl w:ilvl="1" w:tplc="1C090003" w:tentative="1">
+      <w:start w:val="1"/>
+      <w:numFmt w:val="bullet"/>
+      <w:lvlText w:val="o"/>
+      <w:lvlJc w:val="left"/>
+      <w:pPr>
+        <w:ind w:left="1440" w:hanging="360"/>
+      </w:pPr>
+      <w:rPr>
+        <w:rFonts w:ascii="Courier New" w:hAnsi="Courier New" w:cs="Courier New" w:hint="default"/>
+      </w:rPr>
+    </w:lvl>
+    <w:lvl w:ilvl="2" w:tplc="1C090005" w:tentative="1">
+      <w:start w:val="1"/>
+      <w:numFmt w:val="bullet"/>
+      <w:lvlText w:val=""/>
+      <w:lvlJc w:val="left"/>
+      <w:pPr>
+        <w:ind w:left="2160" w:hanging="360"/>
+      </w:pPr>
+      <w:rPr>
+        <w:rFonts w:ascii="Wingdings" w:hAnsi="Wingdings" w:hint="default"/>
+      </w:rPr>
+    </w:lvl>
+    <w:lvl w:ilvl="3" w:tplc="1C090001" w:tentative="1">
+      <w:start w:val="1"/>
+      <w:numFmt w:val="bullet"/>
+      <w:lvlText w:val=""/>
+      <w:lvlJc w:val="left"/>
+      <w:pPr>
+        <w:ind w:left="2880" w:hanging="360"/>
+      </w:pPr>
+      <w:rPr>
+        <w:rFonts w:ascii="Symbol" w:hAnsi="Symbol" w:hint="default"/>
+      </w:rPr>
+    </w:lvl>
+    <w:lvl w:ilvl="4" w:tplc="1C090003" w:tentative="1">
+      <w:start w:val="1"/>
+      <w:numFmt w:val="bullet"/>
+      <w:lvlText w:val="o"/>
+      <w:lvlJc w:val="left"/>
+      <w:pPr>
+        <w:ind w:left="3600" w:hanging="360"/>
+      </w:pPr>
+      <w:rPr>
+        <w:rFonts w:ascii="Courier New" w:hAnsi="Courier New" w:cs="Courier New" w:hint="default"/>
+      </w:rPr>
+    </w:lvl>
+    <w:lvl w:ilvl="5" w:tplc="1C090005" w:tentative="1">
+      <w:start w:val="1"/>
+      <w:numFmt w:val="bullet"/>
+      <w:lvlText w:val=""/>
+      <w:lvlJc w:val="left"/>
+      <w:pPr>
+        <w:ind w:left="4320" w:hanging="360"/>
+      </w:pPr>
+      <w:rPr>
+        <w:rFonts w:ascii="Wingdings" w:hAnsi="Wingdings" w:hint="default"/>
+      </w:rPr>
+    </w:lvl>
+    <w:lvl w:ilvl="6" w:tplc="1C090001" w:tentative="1">
+      <w:start w:val="1"/>
+      <w:numFmt w:val="bullet"/>
+      <w:lvlText w:val=""/>
+      <w:lvlJc w:val="left"/>
+      <w:pPr>
+        <w:ind w:left="5040" w:hanging="360"/>
+      </w:pPr>
+      <w:rPr>
+        <w:rFonts w:ascii="Symbol" w:hAnsi="Symbol" w:hint="default"/>
+      </w:rPr>
+    </w:lvl>
+    <w:lvl w:ilvl="7" w:tplc="1C090003" w:tentative="1">
+      <w:start w:val="1"/>
+      <w:numFmt w:val="bullet"/>
+      <w:lvlText w:val="o"/>
+      <w:lvlJc w:val="left"/>
+      <w:pPr>
+        <w:ind w:left="5760" w:hanging="360"/>
+      </w:pPr>
+      <w:rPr>
+        <w:rFonts w:ascii="Courier New" w:hAnsi="Courier New" w:cs="Courier New" w:hint="default"/>
+      </w:rPr>
+    </w:lvl>
+    <w:lvl w:ilvl="8" w:tplc="1C090005" w:tentative="1">
+      <w:start w:val="1"/>
+      <w:numFmt w:val="bullet"/>
+      <w:lvlText w:val=""/>
+      <w:lvlJc w:val="left"/>
+      <w:pPr>
+        <w:ind w:left="6480" w:hanging="360"/>
+      </w:pPr>
+      <w:rPr>
+        <w:rFonts w:ascii="Wingdings" w:hAnsi="Wingdings" w:hint="default"/>
+      </w:rPr>
+    </w:lvl>
+  </w:abstractNum>
+  <w:abstractNum w:abstractNumId="2" w15:restartNumberingAfterBreak="0">
+    <w:nsid w:val="1FC15C8A"/>
+    <w:multiLevelType w:val="hybridMultilevel"/>
+    <w:tmpl w:val="BC1E4940"/>
+    <w:lvl w:ilvl="0" w:tplc="1C090001">
+      <w:start w:val="1"/>
+      <w:numFmt w:val="bullet"/>
+      <w:lvlText w:val=""/>
+      <w:lvlJc w:val="left"/>
+      <w:pPr>
+        <w:ind w:left="720" w:hanging="360"/>
+      </w:pPr>
+      <w:rPr>
+        <w:rFonts w:ascii="Symbol" w:hAnsi="Symbol" w:hint="default"/>
+      </w:rPr>
+    </w:lvl>
+    <w:lvl w:ilvl="1" w:tplc="1C090003" w:tentative="1">
+      <w:start w:val="1"/>
+      <w:numFmt w:val="bullet"/>
+      <w:lvlText w:val="o"/>
+      <w:lvlJc w:val="left"/>
+      <w:pPr>
+        <w:ind w:left="1440" w:hanging="360"/>
+      </w:pPr>
+      <w:rPr>
+        <w:rFonts w:ascii="Courier New" w:hAnsi="Courier New" w:cs="Courier New" w:hint="default"/>
+      </w:rPr>
+    </w:lvl>
+    <w:lvl w:ilvl="2" w:tplc="1C090005" w:tentative="1">
+      <w:start w:val="1"/>
+      <w:numFmt w:val="bullet"/>
+      <w:lvlText w:val=""/>
+      <w:lvlJc w:val="left"/>
+      <w:pPr>
+        <w:ind w:left="2160" w:hanging="360"/>
+      </w:pPr>
+      <w:rPr>
+        <w:rFonts w:ascii="Wingdings" w:hAnsi="Wingdings" w:hint="default"/>
+      </w:rPr>
+    </w:lvl>
+    <w:lvl w:ilvl="3" w:tplc="1C090001" w:tentative="1">
+      <w:start w:val="1"/>
+      <w:numFmt w:val="bullet"/>
+      <w:lvlText w:val=""/>
+      <w:lvlJc w:val="left"/>
+      <w:pPr>
+        <w:ind w:left="2880" w:hanging="360"/>
+      </w:pPr>
+      <w:rPr>
+        <w:rFonts w:ascii="Symbol" w:hAnsi="Symbol" w:hint="default"/>
+      </w:rPr>
+    </w:lvl>
+    <w:lvl w:ilvl="4" w:tplc="1C090003" w:tentative="1">
+      <w:start w:val="1"/>
+      <w:numFmt w:val="bullet"/>
+      <w:lvlText w:val="o"/>
+      <w:lvlJc w:val="left"/>
+      <w:pPr>
+        <w:ind w:left="3600" w:hanging="360"/>
+      </w:pPr>
+      <w:rPr>
+        <w:rFonts w:ascii="Courier New" w:hAnsi="Courier New" w:cs="Courier New" w:hint="default"/>
+      </w:rPr>
+    </w:lvl>
+    <w:lvl w:ilvl="5" w:tplc="1C090005" w:tentative="1">
+      <w:start w:val="1"/>
+      <w:numFmt w:val="bullet"/>
+      <w:lvlText w:val=""/>
+      <w:lvlJc w:val="left"/>
+      <w:pPr>
+        <w:ind w:left="4320" w:hanging="360"/>
+      </w:pPr>
+      <w:rPr>
+        <w:rFonts w:ascii="Wingdings" w:hAnsi="Wingdings" w:hint="default"/>
+      </w:rPr>
+    </w:lvl>
+    <w:lvl w:ilvl="6" w:tplc="1C090001" w:tentative="1">
+      <w:start w:val="1"/>
+      <w:numFmt w:val="bullet"/>
+      <w:lvlText w:val=""/>
+      <w:lvlJc w:val="left"/>
+      <w:pPr>
+        <w:ind w:left="5040" w:hanging="360"/>
+      </w:pPr>
+      <w:rPr>
+        <w:rFonts w:ascii="Symbol" w:hAnsi="Symbol" w:hint="default"/>
+      </w:rPr>
+    </w:lvl>
+    <w:lvl w:ilvl="7" w:tplc="1C090003" w:tentative="1">
+      <w:start w:val="1"/>
+      <w:numFmt w:val="bullet"/>
+      <w:lvlText w:val="o"/>
+      <w:lvlJc w:val="left"/>
+      <w:pPr>
+        <w:ind w:left="5760" w:hanging="360"/>
+      </w:pPr>
+      <w:rPr>
+        <w:rFonts w:ascii="Courier New" w:hAnsi="Courier New" w:cs="Courier New" w:hint="default"/>
+      </w:rPr>
+    </w:lvl>
+    <w:lvl w:ilvl="8" w:tplc="1C090005" w:tentative="1">
+      <w:start w:val="1"/>
+      <w:numFmt w:val="bullet"/>
+      <w:lvlText w:val=""/>
+      <w:lvlJc w:val="left"/>
+      <w:pPr>
+        <w:ind w:left="6480" w:hanging="360"/>
+      </w:pPr>
+      <w:rPr>
+        <w:rFonts w:ascii="Wingdings" w:hAnsi="Wingdings" w:hint="default"/>
+      </w:rPr>
+    </w:lvl>
+  </w:abstractNum>
+  <w:abstractNum w:abstractNumId="3" w15:restartNumberingAfterBreak="0">
     <w:nsid w:val="2870181E"/>
     <w:multiLevelType w:val="hybridMultilevel"/>
     <w:tmpl w:val="CD806552"/>
@@ -283,8 +1138,365 @@
       </w:rPr>
     </w:lvl>
   </w:abstractNum>
+  <w:abstractNum w:abstractNumId="4" w15:restartNumberingAfterBreak="0">
+    <w:nsid w:val="345D1475"/>
+    <w:multiLevelType w:val="hybridMultilevel"/>
+    <w:tmpl w:val="F710DF52"/>
+    <w:lvl w:ilvl="0" w:tplc="1C090001">
+      <w:start w:val="1"/>
+      <w:numFmt w:val="bullet"/>
+      <w:lvlText w:val=""/>
+      <w:lvlJc w:val="left"/>
+      <w:pPr>
+        <w:ind w:left="720" w:hanging="360"/>
+      </w:pPr>
+      <w:rPr>
+        <w:rFonts w:ascii="Symbol" w:hAnsi="Symbol" w:hint="default"/>
+      </w:rPr>
+    </w:lvl>
+    <w:lvl w:ilvl="1" w:tplc="1C090003" w:tentative="1">
+      <w:start w:val="1"/>
+      <w:numFmt w:val="bullet"/>
+      <w:lvlText w:val="o"/>
+      <w:lvlJc w:val="left"/>
+      <w:pPr>
+        <w:ind w:left="1440" w:hanging="360"/>
+      </w:pPr>
+      <w:rPr>
+        <w:rFonts w:ascii="Courier New" w:hAnsi="Courier New" w:cs="Courier New" w:hint="default"/>
+      </w:rPr>
+    </w:lvl>
+    <w:lvl w:ilvl="2" w:tplc="1C090005" w:tentative="1">
+      <w:start w:val="1"/>
+      <w:numFmt w:val="bullet"/>
+      <w:lvlText w:val=""/>
+      <w:lvlJc w:val="left"/>
+      <w:pPr>
+        <w:ind w:left="2160" w:hanging="360"/>
+      </w:pPr>
+      <w:rPr>
+        <w:rFonts w:ascii="Wingdings" w:hAnsi="Wingdings" w:hint="default"/>
+      </w:rPr>
+    </w:lvl>
+    <w:lvl w:ilvl="3" w:tplc="1C090001" w:tentative="1">
+      <w:start w:val="1"/>
+      <w:numFmt w:val="bullet"/>
+      <w:lvlText w:val=""/>
+      <w:lvlJc w:val="left"/>
+      <w:pPr>
+        <w:ind w:left="2880" w:hanging="360"/>
+      </w:pPr>
+      <w:rPr>
+        <w:rFonts w:ascii="Symbol" w:hAnsi="Symbol" w:hint="default"/>
+      </w:rPr>
+    </w:lvl>
+    <w:lvl w:ilvl="4" w:tplc="1C090003" w:tentative="1">
+      <w:start w:val="1"/>
+      <w:numFmt w:val="bullet"/>
+      <w:lvlText w:val="o"/>
+      <w:lvlJc w:val="left"/>
+      <w:pPr>
+        <w:ind w:left="3600" w:hanging="360"/>
+      </w:pPr>
+      <w:rPr>
+        <w:rFonts w:ascii="Courier New" w:hAnsi="Courier New" w:cs="Courier New" w:hint="default"/>
+      </w:rPr>
+    </w:lvl>
+    <w:lvl w:ilvl="5" w:tplc="1C090005" w:tentative="1">
+      <w:start w:val="1"/>
+      <w:numFmt w:val="bullet"/>
+      <w:lvlText w:val=""/>
+      <w:lvlJc w:val="left"/>
+      <w:pPr>
+        <w:ind w:left="4320" w:hanging="360"/>
+      </w:pPr>
+      <w:rPr>
+        <w:rFonts w:ascii="Wingdings" w:hAnsi="Wingdings" w:hint="default"/>
+      </w:rPr>
+    </w:lvl>
+    <w:lvl w:ilvl="6" w:tplc="1C090001" w:tentative="1">
+      <w:start w:val="1"/>
+      <w:numFmt w:val="bullet"/>
+      <w:lvlText w:val=""/>
+      <w:lvlJc w:val="left"/>
+      <w:pPr>
+        <w:ind w:left="5040" w:hanging="360"/>
+      </w:pPr>
+      <w:rPr>
+        <w:rFonts w:ascii="Symbol" w:hAnsi="Symbol" w:hint="default"/>
+      </w:rPr>
+    </w:lvl>
+    <w:lvl w:ilvl="7" w:tplc="1C090003" w:tentative="1">
+      <w:start w:val="1"/>
+      <w:numFmt w:val="bullet"/>
+      <w:lvlText w:val="o"/>
+      <w:lvlJc w:val="left"/>
+      <w:pPr>
+        <w:ind w:left="5760" w:hanging="360"/>
+      </w:pPr>
+      <w:rPr>
+        <w:rFonts w:ascii="Courier New" w:hAnsi="Courier New" w:cs="Courier New" w:hint="default"/>
+      </w:rPr>
+    </w:lvl>
+    <w:lvl w:ilvl="8" w:tplc="1C090005" w:tentative="1">
+      <w:start w:val="1"/>
+      <w:numFmt w:val="bullet"/>
+      <w:lvlText w:val=""/>
+      <w:lvlJc w:val="left"/>
+      <w:pPr>
+        <w:ind w:left="6480" w:hanging="360"/>
+      </w:pPr>
+      <w:rPr>
+        <w:rFonts w:ascii="Wingdings" w:hAnsi="Wingdings" w:hint="default"/>
+      </w:rPr>
+    </w:lvl>
+  </w:abstractNum>
+  <w:abstractNum w:abstractNumId="5" w15:restartNumberingAfterBreak="0">
+    <w:nsid w:val="414E1CBB"/>
+    <w:multiLevelType w:val="hybridMultilevel"/>
+    <w:tmpl w:val="67964C0A"/>
+    <w:lvl w:ilvl="0" w:tplc="1C090001">
+      <w:start w:val="1"/>
+      <w:numFmt w:val="bullet"/>
+      <w:lvlText w:val=""/>
+      <w:lvlJc w:val="left"/>
+      <w:pPr>
+        <w:ind w:left="720" w:hanging="360"/>
+      </w:pPr>
+      <w:rPr>
+        <w:rFonts w:ascii="Symbol" w:hAnsi="Symbol" w:hint="default"/>
+      </w:rPr>
+    </w:lvl>
+    <w:lvl w:ilvl="1" w:tplc="1C090003" w:tentative="1">
+      <w:start w:val="1"/>
+      <w:numFmt w:val="bullet"/>
+      <w:lvlText w:val="o"/>
+      <w:lvlJc w:val="left"/>
+      <w:pPr>
+        <w:ind w:left="1440" w:hanging="360"/>
+      </w:pPr>
+      <w:rPr>
+        <w:rFonts w:ascii="Courier New" w:hAnsi="Courier New" w:cs="Courier New" w:hint="default"/>
+      </w:rPr>
+    </w:lvl>
+    <w:lvl w:ilvl="2" w:tplc="1C090005" w:tentative="1">
+      <w:start w:val="1"/>
+      <w:numFmt w:val="bullet"/>
+      <w:lvlText w:val=""/>
+      <w:lvlJc w:val="left"/>
+      <w:pPr>
+        <w:ind w:left="2160" w:hanging="360"/>
+      </w:pPr>
+      <w:rPr>
+        <w:rFonts w:ascii="Wingdings" w:hAnsi="Wingdings" w:hint="default"/>
+      </w:rPr>
+    </w:lvl>
+    <w:lvl w:ilvl="3" w:tplc="1C090001" w:tentative="1">
+      <w:start w:val="1"/>
+      <w:numFmt w:val="bullet"/>
+      <w:lvlText w:val=""/>
+      <w:lvlJc w:val="left"/>
+      <w:pPr>
+        <w:ind w:left="2880" w:hanging="360"/>
+      </w:pPr>
+      <w:rPr>
+        <w:rFonts w:ascii="Symbol" w:hAnsi="Symbol" w:hint="default"/>
+      </w:rPr>
+    </w:lvl>
+    <w:lvl w:ilvl="4" w:tplc="1C090003" w:tentative="1">
+      <w:start w:val="1"/>
+      <w:numFmt w:val="bullet"/>
+      <w:lvlText w:val="o"/>
+      <w:lvlJc w:val="left"/>
+      <w:pPr>
+        <w:ind w:left="3600" w:hanging="360"/>
+      </w:pPr>
+      <w:rPr>
+        <w:rFonts w:ascii="Courier New" w:hAnsi="Courier New" w:cs="Courier New" w:hint="default"/>
+      </w:rPr>
+    </w:lvl>
+    <w:lvl w:ilvl="5" w:tplc="1C090005" w:tentative="1">
+      <w:start w:val="1"/>
+      <w:numFmt w:val="bullet"/>
+      <w:lvlText w:val=""/>
+      <w:lvlJc w:val="left"/>
+      <w:pPr>
+        <w:ind w:left="4320" w:hanging="360"/>
+      </w:pPr>
+      <w:rPr>
+        <w:rFonts w:ascii="Wingdings" w:hAnsi="Wingdings" w:hint="default"/>
+      </w:rPr>
+    </w:lvl>
+    <w:lvl w:ilvl="6" w:tplc="1C090001" w:tentative="1">
+      <w:start w:val="1"/>
+      <w:numFmt w:val="bullet"/>
+      <w:lvlText w:val=""/>
+      <w:lvlJc w:val="left"/>
+      <w:pPr>
+        <w:ind w:left="5040" w:hanging="360"/>
+      </w:pPr>
+      <w:rPr>
+        <w:rFonts w:ascii="Symbol" w:hAnsi="Symbol" w:hint="default"/>
+      </w:rPr>
+    </w:lvl>
+    <w:lvl w:ilvl="7" w:tplc="1C090003" w:tentative="1">
+      <w:start w:val="1"/>
+      <w:numFmt w:val="bullet"/>
+      <w:lvlText w:val="o"/>
+      <w:lvlJc w:val="left"/>
+      <w:pPr>
+        <w:ind w:left="5760" w:hanging="360"/>
+      </w:pPr>
+      <w:rPr>
+        <w:rFonts w:ascii="Courier New" w:hAnsi="Courier New" w:cs="Courier New" w:hint="default"/>
+      </w:rPr>
+    </w:lvl>
+    <w:lvl w:ilvl="8" w:tplc="1C090005" w:tentative="1">
+      <w:start w:val="1"/>
+      <w:numFmt w:val="bullet"/>
+      <w:lvlText w:val=""/>
+      <w:lvlJc w:val="left"/>
+      <w:pPr>
+        <w:ind w:left="6480" w:hanging="360"/>
+      </w:pPr>
+      <w:rPr>
+        <w:rFonts w:ascii="Wingdings" w:hAnsi="Wingdings" w:hint="default"/>
+      </w:rPr>
+    </w:lvl>
+  </w:abstractNum>
+  <w:abstractNum w:abstractNumId="6" w15:restartNumberingAfterBreak="0">
+    <w:nsid w:val="4AA679C4"/>
+    <w:multiLevelType w:val="hybridMultilevel"/>
+    <w:tmpl w:val="44F00928"/>
+    <w:lvl w:ilvl="0" w:tplc="1C090001">
+      <w:start w:val="1"/>
+      <w:numFmt w:val="bullet"/>
+      <w:lvlText w:val=""/>
+      <w:lvlJc w:val="left"/>
+      <w:pPr>
+        <w:ind w:left="720" w:hanging="360"/>
+      </w:pPr>
+      <w:rPr>
+        <w:rFonts w:ascii="Symbol" w:hAnsi="Symbol" w:hint="default"/>
+      </w:rPr>
+    </w:lvl>
+    <w:lvl w:ilvl="1" w:tplc="1C090003" w:tentative="1">
+      <w:start w:val="1"/>
+      <w:numFmt w:val="bullet"/>
+      <w:lvlText w:val="o"/>
+      <w:lvlJc w:val="left"/>
+      <w:pPr>
+        <w:ind w:left="1440" w:hanging="360"/>
+      </w:pPr>
+      <w:rPr>
+        <w:rFonts w:ascii="Courier New" w:hAnsi="Courier New" w:cs="Courier New" w:hint="default"/>
+      </w:rPr>
+    </w:lvl>
+    <w:lvl w:ilvl="2" w:tplc="1C090005" w:tentative="1">
+      <w:start w:val="1"/>
+      <w:numFmt w:val="bullet"/>
+      <w:lvlText w:val=""/>
+      <w:lvlJc w:val="left"/>
+      <w:pPr>
+        <w:ind w:left="2160" w:hanging="360"/>
+      </w:pPr>
+      <w:rPr>
+        <w:rFonts w:ascii="Wingdings" w:hAnsi="Wingdings" w:hint="default"/>
+      </w:rPr>
+    </w:lvl>
+    <w:lvl w:ilvl="3" w:tplc="1C090001" w:tentative="1">
+      <w:start w:val="1"/>
+      <w:numFmt w:val="bullet"/>
+      <w:lvlText w:val=""/>
+      <w:lvlJc w:val="left"/>
+      <w:pPr>
+        <w:ind w:left="2880" w:hanging="360"/>
+      </w:pPr>
+      <w:rPr>
+        <w:rFonts w:ascii="Symbol" w:hAnsi="Symbol" w:hint="default"/>
+      </w:rPr>
+    </w:lvl>
+    <w:lvl w:ilvl="4" w:tplc="1C090003" w:tentative="1">
+      <w:start w:val="1"/>
+      <w:numFmt w:val="bullet"/>
+      <w:lvlText w:val="o"/>
+      <w:lvlJc w:val="left"/>
+      <w:pPr>
+        <w:ind w:left="3600" w:hanging="360"/>
+      </w:pPr>
+      <w:rPr>
+        <w:rFonts w:ascii="Courier New" w:hAnsi="Courier New" w:cs="Courier New" w:hint="default"/>
+      </w:rPr>
+    </w:lvl>
+    <w:lvl w:ilvl="5" w:tplc="1C090005" w:tentative="1">
+      <w:start w:val="1"/>
+      <w:numFmt w:val="bullet"/>
+      <w:lvlText w:val=""/>
+      <w:lvlJc w:val="left"/>
+      <w:pPr>
+        <w:ind w:left="4320" w:hanging="360"/>
+      </w:pPr>
+      <w:rPr>
+        <w:rFonts w:ascii="Wingdings" w:hAnsi="Wingdings" w:hint="default"/>
+      </w:rPr>
+    </w:lvl>
+    <w:lvl w:ilvl="6" w:tplc="1C090001" w:tentative="1">
+      <w:start w:val="1"/>
+      <w:numFmt w:val="bullet"/>
+      <w:lvlText w:val=""/>
+      <w:lvlJc w:val="left"/>
+      <w:pPr>
+        <w:ind w:left="5040" w:hanging="360"/>
+      </w:pPr>
+      <w:rPr>
+        <w:rFonts w:ascii="Symbol" w:hAnsi="Symbol" w:hint="default"/>
+      </w:rPr>
+    </w:lvl>
+    <w:lvl w:ilvl="7" w:tplc="1C090003" w:tentative="1">
+      <w:start w:val="1"/>
+      <w:numFmt w:val="bullet"/>
+      <w:lvlText w:val="o"/>
+      <w:lvlJc w:val="left"/>
+      <w:pPr>
+        <w:ind w:left="5760" w:hanging="360"/>
+      </w:pPr>
+      <w:rPr>
+        <w:rFonts w:ascii="Courier New" w:hAnsi="Courier New" w:cs="Courier New" w:hint="default"/>
+      </w:rPr>
+    </w:lvl>
+    <w:lvl w:ilvl="8" w:tplc="1C090005" w:tentative="1">
+      <w:start w:val="1"/>
+      <w:numFmt w:val="bullet"/>
+      <w:lvlText w:val=""/>
+      <w:lvlJc w:val="left"/>
+      <w:pPr>
+        <w:ind w:left="6480" w:hanging="360"/>
+      </w:pPr>
+      <w:rPr>
+        <w:rFonts w:ascii="Wingdings" w:hAnsi="Wingdings" w:hint="default"/>
+      </w:rPr>
+    </w:lvl>
+  </w:abstractNum>
   <w:num w:numId="1" w16cid:durableId="1899977611">
+    <w:abstractNumId w:val="3"/>
+  </w:num>
+  <w:num w:numId="2" w16cid:durableId="58984939">
+    <w:abstractNumId w:val="4"/>
+  </w:num>
+  <w:num w:numId="3" w16cid:durableId="2105764032">
+    <w:abstractNumId w:val="6"/>
+  </w:num>
+  <w:num w:numId="4" w16cid:durableId="414015394">
+    <w:abstractNumId w:val="2"/>
+  </w:num>
+  <w:num w:numId="5" w16cid:durableId="1991014030">
     <w:abstractNumId w:val="0"/>
+  </w:num>
+  <w:num w:numId="6" w16cid:durableId="1063797914">
+    <w:abstractNumId w:val="1"/>
+  </w:num>
+  <w:num w:numId="7" w16cid:durableId="277298104">
+    <w:abstractNumId w:val="5"/>
   </w:num>
 </w:numbering>
 </file>

</xml_diff>

<commit_message>
Added UML Diagram and updated 2.2 and 2.3
</commit_message>
<xml_diff>
--- a/Final PDF.docx
+++ b/Final PDF.docx
@@ -35,6 +35,9 @@
           <w:numId w:val="1"/>
         </w:numPr>
       </w:pPr>
+      <w:r>
+        <w:t>u24742512 – Thabo Ngwabi</w:t>
+      </w:r>
     </w:p>
     <w:p/>
     <w:p>
@@ -293,11 +296,21 @@
       <w:r>
         <w:t xml:space="preserve">, State: </w:t>
       </w:r>
+      <w:proofErr w:type="spellStart"/>
       <w:r>
         <w:t>TravelState</w:t>
       </w:r>
-      <w:r>
-        <w:t xml:space="preserve">, ConcreteState: </w:t>
+      <w:proofErr w:type="spellEnd"/>
+      <w:r>
+        <w:t xml:space="preserve">, </w:t>
+      </w:r>
+      <w:proofErr w:type="spellStart"/>
+      <w:r>
+        <w:t>ConcreteState</w:t>
+      </w:r>
+      <w:proofErr w:type="spellEnd"/>
+      <w:r>
+        <w:t xml:space="preserve">: </w:t>
       </w:r>
       <w:r>
         <w:t xml:space="preserve">Eg: </w:t>
@@ -311,8 +324,37 @@
       <w:r>
         <w:tab/>
       </w:r>
-      <w:r>
-        <w:t>WalkingState, DrivingState, SwimmingState, FlyingState, etc</w:t>
+      <w:proofErr w:type="spellStart"/>
+      <w:r>
+        <w:t>WalkingState</w:t>
+      </w:r>
+      <w:proofErr w:type="spellEnd"/>
+      <w:r>
+        <w:t xml:space="preserve">, </w:t>
+      </w:r>
+      <w:proofErr w:type="spellStart"/>
+      <w:r>
+        <w:t>DrivingState</w:t>
+      </w:r>
+      <w:proofErr w:type="spellEnd"/>
+      <w:r>
+        <w:t xml:space="preserve">, </w:t>
+      </w:r>
+      <w:proofErr w:type="spellStart"/>
+      <w:r>
+        <w:t>SwimmingState</w:t>
+      </w:r>
+      <w:proofErr w:type="spellEnd"/>
+      <w:r>
+        <w:t xml:space="preserve">, </w:t>
+      </w:r>
+      <w:proofErr w:type="spellStart"/>
+      <w:r>
+        <w:t>FlyingState</w:t>
+      </w:r>
+      <w:proofErr w:type="spellEnd"/>
+      <w:r>
+        <w:t>, etc</w:t>
       </w:r>
       <w:r>
         <w:br/>
@@ -332,9 +374,11 @@
       <w:r>
         <w:t xml:space="preserve">, Strategy: </w:t>
       </w:r>
+      <w:proofErr w:type="spellStart"/>
       <w:r>
         <w:t>RouteStrategy</w:t>
       </w:r>
+      <w:proofErr w:type="spellEnd"/>
       <w:r>
         <w:t xml:space="preserve">, Concrete Strategy: </w:t>
       </w:r>
@@ -347,8 +391,29 @@
       <w:r>
         <w:tab/>
       </w:r>
-      <w:r>
-        <w:t>FastestRoute, ShortestRoute, ScenicRoute, etc.</w:t>
+      <w:proofErr w:type="spellStart"/>
+      <w:r>
+        <w:t>FastestRoute</w:t>
+      </w:r>
+      <w:proofErr w:type="spellEnd"/>
+      <w:r>
+        <w:t xml:space="preserve">, </w:t>
+      </w:r>
+      <w:proofErr w:type="spellStart"/>
+      <w:r>
+        <w:t>ShortestRoute</w:t>
+      </w:r>
+      <w:proofErr w:type="spellEnd"/>
+      <w:r>
+        <w:t xml:space="preserve">, </w:t>
+      </w:r>
+      <w:proofErr w:type="spellStart"/>
+      <w:r>
+        <w:t>ScenicRoute</w:t>
+      </w:r>
+      <w:proofErr w:type="spellEnd"/>
+      <w:r>
+        <w:t>, etc.</w:t>
       </w:r>
       <w:r>
         <w:br/>
@@ -374,9 +439,15 @@
       </w:r>
       <w:r>
         <w:tab/>
-      </w:r>
-      <w:r>
-        <w:t>Component: MapComponent, Leaf: Location, Composite: Region</w:t>
+        <w:t xml:space="preserve">Component: </w:t>
+      </w:r>
+      <w:proofErr w:type="spellStart"/>
+      <w:r>
+        <w:t>MapComponent</w:t>
+      </w:r>
+      <w:proofErr w:type="spellEnd"/>
+      <w:r>
+        <w:t>, Leaf: Location, Composite: Region</w:t>
       </w:r>
       <w:r>
         <w:br/>
@@ -386,31 +457,68 @@
         <w:t>Decorator(Place Features):</w:t>
       </w:r>
       <w:r>
-        <w:t xml:space="preserve"> Component: MapComponent, ConcreteComponent: </w:t>
-      </w:r>
-      <w:r>
-        <w:tab/>
-      </w:r>
-      <w:r>
-        <w:tab/>
-      </w:r>
-      <w:r>
-        <w:t xml:space="preserve">Location, Decorator: Decorator, ConcreteDecorator: Eg: </w:t>
-      </w:r>
-      <w:r>
-        <w:tab/>
-      </w:r>
-      <w:r>
-        <w:tab/>
-      </w:r>
-      <w:r>
-        <w:tab/>
-      </w:r>
-      <w:r>
-        <w:tab/>
-      </w:r>
-      <w:r>
-        <w:t>WhetherDecorator, TerrainDecorator, etc.</w:t>
+        <w:t xml:space="preserve"> Component: </w:t>
+      </w:r>
+      <w:proofErr w:type="spellStart"/>
+      <w:r>
+        <w:t>MapComponent</w:t>
+      </w:r>
+      <w:proofErr w:type="spellEnd"/>
+      <w:r>
+        <w:t xml:space="preserve">, </w:t>
+      </w:r>
+      <w:proofErr w:type="spellStart"/>
+      <w:r>
+        <w:t>ConcreteComponent</w:t>
+      </w:r>
+      <w:proofErr w:type="spellEnd"/>
+      <w:r>
+        <w:t xml:space="preserve">: </w:t>
+      </w:r>
+      <w:r>
+        <w:tab/>
+      </w:r>
+      <w:r>
+        <w:tab/>
+      </w:r>
+      <w:r>
+        <w:t xml:space="preserve">Location, Decorator: Decorator, </w:t>
+      </w:r>
+      <w:proofErr w:type="spellStart"/>
+      <w:r>
+        <w:t>ConcreteDecorator</w:t>
+      </w:r>
+      <w:proofErr w:type="spellEnd"/>
+      <w:r>
+        <w:t xml:space="preserve">: Eg: </w:t>
+      </w:r>
+      <w:r>
+        <w:tab/>
+      </w:r>
+      <w:r>
+        <w:tab/>
+      </w:r>
+      <w:r>
+        <w:tab/>
+      </w:r>
+      <w:r>
+        <w:tab/>
+      </w:r>
+      <w:proofErr w:type="spellStart"/>
+      <w:r>
+        <w:t>WhetherDecorator</w:t>
+      </w:r>
+      <w:proofErr w:type="spellEnd"/>
+      <w:r>
+        <w:t xml:space="preserve">, </w:t>
+      </w:r>
+      <w:proofErr w:type="spellStart"/>
+      <w:r>
+        <w:t>TerrainDecorator</w:t>
+      </w:r>
+      <w:proofErr w:type="spellEnd"/>
+      <w:r>
+        <w:t>, etc.</w:t>
       </w:r>
       <w:r>
         <w:br/>
@@ -420,43 +528,138 @@
         <w:t>Abstract Factory(Biomes):</w:t>
       </w:r>
       <w:r>
-        <w:t xml:space="preserve"> AbstractFacroty: WorldFactory, ConcreteFactory: </w:t>
-      </w:r>
-      <w:r>
-        <w:tab/>
-      </w:r>
-      <w:r>
-        <w:tab/>
-      </w:r>
-      <w:r>
-        <w:tab/>
-      </w:r>
-      <w:r>
-        <w:t xml:space="preserve">DesertFactory, VolcanoFactory, etc. AbstractProduct: AbstractNPC, </w:t>
-      </w:r>
-      <w:r>
-        <w:tab/>
-      </w:r>
-      <w:r>
-        <w:tab/>
-      </w:r>
-      <w:r>
-        <w:tab/>
-      </w:r>
-      <w:r>
-        <w:t xml:space="preserve">AbstractTerrain, AbstractObstacle, ConcreteProduct: DesertTerrain, </w:t>
-      </w:r>
-      <w:r>
-        <w:tab/>
-      </w:r>
-      <w:r>
-        <w:tab/>
-      </w:r>
-      <w:r>
-        <w:tab/>
-      </w:r>
-      <w:r>
-        <w:t>DesertNPC, etc. Client: MapComponent or abstract (game code).</w:t>
+        <w:t xml:space="preserve"> </w:t>
+      </w:r>
+      <w:proofErr w:type="spellStart"/>
+      <w:r>
+        <w:t>AbstractFacroty</w:t>
+      </w:r>
+      <w:proofErr w:type="spellEnd"/>
+      <w:r>
+        <w:t xml:space="preserve">: </w:t>
+      </w:r>
+      <w:proofErr w:type="spellStart"/>
+      <w:r>
+        <w:t>WorldFactory</w:t>
+      </w:r>
+      <w:proofErr w:type="spellEnd"/>
+      <w:r>
+        <w:t xml:space="preserve">, </w:t>
+      </w:r>
+      <w:proofErr w:type="spellStart"/>
+      <w:r>
+        <w:t>ConcreteFactory</w:t>
+      </w:r>
+      <w:proofErr w:type="spellEnd"/>
+      <w:r>
+        <w:t xml:space="preserve">: </w:t>
+      </w:r>
+      <w:r>
+        <w:tab/>
+      </w:r>
+      <w:r>
+        <w:tab/>
+      </w:r>
+      <w:r>
+        <w:tab/>
+      </w:r>
+      <w:proofErr w:type="spellStart"/>
+      <w:r>
+        <w:t>DesertFactory</w:t>
+      </w:r>
+      <w:proofErr w:type="spellEnd"/>
+      <w:r>
+        <w:t xml:space="preserve">, </w:t>
+      </w:r>
+      <w:proofErr w:type="spellStart"/>
+      <w:r>
+        <w:t>VolcanoFactory</w:t>
+      </w:r>
+      <w:proofErr w:type="spellEnd"/>
+      <w:r>
+        <w:t xml:space="preserve">, etc. </w:t>
+      </w:r>
+      <w:proofErr w:type="spellStart"/>
+      <w:r>
+        <w:t>AbstractProduct</w:t>
+      </w:r>
+      <w:proofErr w:type="spellEnd"/>
+      <w:r>
+        <w:t xml:space="preserve">: </w:t>
+      </w:r>
+      <w:proofErr w:type="spellStart"/>
+      <w:r>
+        <w:t>AbstractNPC</w:t>
+      </w:r>
+      <w:proofErr w:type="spellEnd"/>
+      <w:r>
+        <w:t xml:space="preserve">, </w:t>
+      </w:r>
+      <w:r>
+        <w:tab/>
+      </w:r>
+      <w:r>
+        <w:tab/>
+      </w:r>
+      <w:r>
+        <w:tab/>
+      </w:r>
+      <w:proofErr w:type="spellStart"/>
+      <w:r>
+        <w:t>AbstractTerrain</w:t>
+      </w:r>
+      <w:proofErr w:type="spellEnd"/>
+      <w:r>
+        <w:t xml:space="preserve">, </w:t>
+      </w:r>
+      <w:proofErr w:type="spellStart"/>
+      <w:r>
+        <w:t>AbstractObstacle</w:t>
+      </w:r>
+      <w:proofErr w:type="spellEnd"/>
+      <w:r>
+        <w:t xml:space="preserve">, </w:t>
+      </w:r>
+      <w:proofErr w:type="spellStart"/>
+      <w:r>
+        <w:t>ConcreteProduct</w:t>
+      </w:r>
+      <w:proofErr w:type="spellEnd"/>
+      <w:r>
+        <w:t xml:space="preserve">: </w:t>
+      </w:r>
+      <w:proofErr w:type="spellStart"/>
+      <w:r>
+        <w:t>DesertTerrain</w:t>
+      </w:r>
+      <w:proofErr w:type="spellEnd"/>
+      <w:r>
+        <w:t xml:space="preserve">, </w:t>
+      </w:r>
+      <w:r>
+        <w:tab/>
+      </w:r>
+      <w:r>
+        <w:tab/>
+      </w:r>
+      <w:r>
+        <w:tab/>
+      </w:r>
+      <w:proofErr w:type="spellStart"/>
+      <w:r>
+        <w:t>DesertNPC</w:t>
+      </w:r>
+      <w:proofErr w:type="spellEnd"/>
+      <w:r>
+        <w:t xml:space="preserve">, etc. Client: </w:t>
+      </w:r>
+      <w:proofErr w:type="spellStart"/>
+      <w:r>
+        <w:t>MapComponent</w:t>
+      </w:r>
+      <w:proofErr w:type="spellEnd"/>
+      <w:r>
+        <w:t xml:space="preserve"> or abstract (game code).</w:t>
       </w:r>
     </w:p>
     <w:p>
@@ -513,8 +716,6 @@
       </w:r>
       <w:r>
         <w:tab/>
-      </w:r>
-      <w:r>
         <w:t xml:space="preserve">Decorator is implemented using subclasses for combinations (It is required that </w:t>
       </w:r>
       <w:r>
@@ -543,14 +744,10 @@
       </w:r>
       <w:r>
         <w:tab/>
-      </w:r>
-      <w:r>
         <w:t xml:space="preserve">abstract classes for interfaces and thus there is no proper abstraction being </w:t>
       </w:r>
       <w:r>
         <w:tab/>
-      </w:r>
-      <w:r>
         <w:t>used when defining interfaces and concrete implementations.)</w:t>
       </w:r>
       <w:r>
@@ -558,8 +755,6 @@
       </w:r>
       <w:r>
         <w:tab/>
-      </w:r>
-      <w:r>
         <w:t xml:space="preserve">Incorrect Composite Structure (Location and Region don’t properly share a </w:t>
       </w:r>
       <w:r>
@@ -595,33 +790,33 @@
       </w:r>
       <w:r>
         <w:tab/>
-      </w:r>
-      <w:r>
         <w:t xml:space="preserve">virtual </w:t>
       </w:r>
       <w:r>
         <w:tab/>
-      </w:r>
-      <w:r>
         <w:t xml:space="preserve">destructors and as such if their derived classes cannot call their </w:t>
       </w:r>
       <w:r>
         <w:tab/>
-      </w:r>
-      <w:r>
         <w:t xml:space="preserve">destructors when they destruct could lead to memory leaks or undefined </w:t>
       </w:r>
       <w:r>
         <w:tab/>
-      </w:r>
-      <w:r>
         <w:t>behaviour.)</w:t>
       </w:r>
       <w:r>
         <w:br/>
       </w:r>
       <w:r>
-        <w:t xml:space="preserve">Excessive Coupling: GameManager has excessive Coupling (It is responsible for every </w:t>
+        <w:t xml:space="preserve">Excessive Coupling: </w:t>
+      </w:r>
+      <w:proofErr w:type="spellStart"/>
+      <w:r>
+        <w:t>GameManager</w:t>
+      </w:r>
+      <w:proofErr w:type="spellEnd"/>
+      <w:r>
+        <w:t xml:space="preserve"> has excessive Coupling (It is responsible for every </w:t>
       </w:r>
       <w:r>
         <w:tab/>
@@ -647,8 +842,13 @@
       <w:r>
         <w:tab/>
       </w:r>
-      <w:r>
-        <w:t>GameManager too must change.</w:t>
+      <w:proofErr w:type="spellStart"/>
+      <w:r>
+        <w:t>GameManager</w:t>
+      </w:r>
+      <w:proofErr w:type="spellEnd"/>
+      <w:r>
+        <w:t xml:space="preserve"> too must change.</w:t>
       </w:r>
       <w:r>
         <w:t>)</w:t>
@@ -659,7 +859,23 @@
         <w:t>1.4)</w:t>
       </w:r>
       <w:r>
-        <w:t xml:space="preserve"> GameManager knows about everything. This breaks the purpose of design patterns to separate the responsibilities of every subsystem. The GameManager class should coordinate the systems rather than implement </w:t>
+        <w:t xml:space="preserve"> </w:t>
+      </w:r>
+      <w:proofErr w:type="spellStart"/>
+      <w:r>
+        <w:t>GameManager</w:t>
+      </w:r>
+      <w:proofErr w:type="spellEnd"/>
+      <w:r>
+        <w:t xml:space="preserve"> knows about everything. This breaks the purpose of design patterns to separate the responsibilities of every subsystem. The </w:t>
+      </w:r>
+      <w:proofErr w:type="spellStart"/>
+      <w:r>
+        <w:t>GameManager</w:t>
+      </w:r>
+      <w:proofErr w:type="spellEnd"/>
+      <w:r>
+        <w:t xml:space="preserve"> class should coordinate the systems rather than implement </w:t>
       </w:r>
       <w:r>
         <w:t>all</w:t>
@@ -671,17 +887,62 @@
         <w:t>all</w:t>
       </w:r>
       <w:r>
-        <w:t xml:space="preserve"> the behaviour, if one subsystem is changed, GameManager needs to change itself as well</w:t>
-      </w:r>
-      <w:r>
-        <w:t xml:space="preserve">, defeating coupling goals. Traveller should own its TravelState. Trip should own its RouteStrategy. </w:t>
-      </w:r>
-      <w:r>
-        <w:t>Region should own its MapComponents. Decorator should own the MapComponent it wraps</w:t>
-      </w:r>
-      <w:r>
-        <w:t>. WorldFactory</w:t>
-      </w:r>
+        <w:t xml:space="preserve"> the behaviour, if one subsystem is changed, </w:t>
+      </w:r>
+      <w:proofErr w:type="spellStart"/>
+      <w:r>
+        <w:t>GameManager</w:t>
+      </w:r>
+      <w:proofErr w:type="spellEnd"/>
+      <w:r>
+        <w:t xml:space="preserve"> needs to change itself as well</w:t>
+      </w:r>
+      <w:r>
+        <w:t xml:space="preserve">, defeating coupling goals. Traveller should own its </w:t>
+      </w:r>
+      <w:proofErr w:type="spellStart"/>
+      <w:r>
+        <w:t>TravelState</w:t>
+      </w:r>
+      <w:proofErr w:type="spellEnd"/>
+      <w:r>
+        <w:t xml:space="preserve">. Trip should own its </w:t>
+      </w:r>
+      <w:proofErr w:type="spellStart"/>
+      <w:r>
+        <w:t>RouteStrategy</w:t>
+      </w:r>
+      <w:proofErr w:type="spellEnd"/>
+      <w:r>
+        <w:t xml:space="preserve">. </w:t>
+      </w:r>
+      <w:r>
+        <w:t xml:space="preserve">Region should own its </w:t>
+      </w:r>
+      <w:proofErr w:type="spellStart"/>
+      <w:r>
+        <w:t>MapComponents</w:t>
+      </w:r>
+      <w:proofErr w:type="spellEnd"/>
+      <w:r>
+        <w:t xml:space="preserve">. Decorator should own the </w:t>
+      </w:r>
+      <w:proofErr w:type="spellStart"/>
+      <w:r>
+        <w:t>MapComponent</w:t>
+      </w:r>
+      <w:proofErr w:type="spellEnd"/>
+      <w:r>
+        <w:t xml:space="preserve"> it wraps</w:t>
+      </w:r>
+      <w:r>
+        <w:t xml:space="preserve">. </w:t>
+      </w:r>
+      <w:proofErr w:type="spellStart"/>
+      <w:r>
+        <w:t>WorldFactory</w:t>
+      </w:r>
+      <w:proofErr w:type="spellEnd"/>
       <w:r>
         <w:t xml:space="preserve"> (and its concrete implementations)</w:t>
       </w:r>
@@ -703,18 +964,10 @@
         <w:t xml:space="preserve"> </w:t>
       </w:r>
       <w:r>
-        <w:t>The diagram is hard to read because too many classes, relationships, and pattern labels are crowded together</w:t>
-      </w:r>
-      <w:r>
-        <w:t xml:space="preserve"> or overlapping</w:t>
-      </w:r>
-      <w:r>
-        <w:t>, making the structure unclear.</w:t>
+        <w:t>The diagram is hard to read because too many classes, relationships, and pattern labels are crowded together or overlapping, making the structure unclear.</w:t>
       </w:r>
       <w:r>
         <w:br/>
-      </w:r>
-      <w:r>
         <w:t>It could be improved by separating each subsystem, grouping related classes, using consistent spacing, and clearly showing the relationships between them.</w:t>
       </w:r>
     </w:p>
@@ -739,7 +992,498 @@
     </w:p>
     <w:p>
       <w:r>
+        <w:t>Composite:</w:t>
+      </w:r>
+    </w:p>
+    <w:p>
+      <w:pPr>
+        <w:numPr>
+          <w:ilvl w:val="0"/>
+          <w:numId w:val="2"/>
+        </w:numPr>
+      </w:pPr>
+      <w:r>
+        <w:t xml:space="preserve">Component: </w:t>
+      </w:r>
+      <w:proofErr w:type="spellStart"/>
+      <w:r>
+        <w:t>MapComponent</w:t>
+      </w:r>
+      <w:proofErr w:type="spellEnd"/>
+    </w:p>
+    <w:p>
+      <w:pPr>
+        <w:numPr>
+          <w:ilvl w:val="0"/>
+          <w:numId w:val="2"/>
+        </w:numPr>
+      </w:pPr>
+      <w:r>
+        <w:t>Composite: Region</w:t>
+      </w:r>
+    </w:p>
+    <w:p>
+      <w:pPr>
+        <w:numPr>
+          <w:ilvl w:val="0"/>
+          <w:numId w:val="2"/>
+        </w:numPr>
+      </w:pPr>
+      <w:r>
+        <w:t>Leaf: Location</w:t>
+      </w:r>
+    </w:p>
+    <w:p>
+      <w:r>
+        <w:t>Decorator:</w:t>
+      </w:r>
+    </w:p>
+    <w:p>
+      <w:pPr>
+        <w:numPr>
+          <w:ilvl w:val="0"/>
+          <w:numId w:val="3"/>
+        </w:numPr>
+      </w:pPr>
+      <w:r>
+        <w:t xml:space="preserve">Component: </w:t>
+      </w:r>
+      <w:proofErr w:type="spellStart"/>
+      <w:r>
+        <w:t>MapComponent</w:t>
+      </w:r>
+      <w:proofErr w:type="spellEnd"/>
+    </w:p>
+    <w:p>
+      <w:pPr>
+        <w:numPr>
+          <w:ilvl w:val="0"/>
+          <w:numId w:val="3"/>
+        </w:numPr>
+      </w:pPr>
+      <w:proofErr w:type="spellStart"/>
+      <w:r>
+        <w:t>ConcreteComponent</w:t>
+      </w:r>
+      <w:proofErr w:type="spellEnd"/>
+      <w:r>
+        <w:t>: Location</w:t>
+      </w:r>
+    </w:p>
+    <w:p>
+      <w:pPr>
+        <w:numPr>
+          <w:ilvl w:val="0"/>
+          <w:numId w:val="3"/>
+        </w:numPr>
+      </w:pPr>
+      <w:r>
+        <w:t>Decorator: Decorator</w:t>
+      </w:r>
+    </w:p>
+    <w:p>
+      <w:pPr>
+        <w:numPr>
+          <w:ilvl w:val="0"/>
+          <w:numId w:val="3"/>
+        </w:numPr>
+      </w:pPr>
+      <w:proofErr w:type="spellStart"/>
+      <w:r>
+        <w:t>ConcreteDecorator</w:t>
+      </w:r>
+      <w:proofErr w:type="spellEnd"/>
+      <w:r>
+        <w:t xml:space="preserve">: </w:t>
+      </w:r>
+      <w:proofErr w:type="spellStart"/>
+      <w:r>
+        <w:t>WeatherDecorator</w:t>
+      </w:r>
+      <w:proofErr w:type="spellEnd"/>
+      <w:r>
+        <w:t xml:space="preserve">, </w:t>
+      </w:r>
+      <w:proofErr w:type="spellStart"/>
+      <w:r>
+        <w:t>TerrainDecorator</w:t>
+      </w:r>
+      <w:proofErr w:type="spellEnd"/>
+      <w:r>
+        <w:t xml:space="preserve">, </w:t>
+      </w:r>
+      <w:proofErr w:type="spellStart"/>
+      <w:r>
+        <w:t>TollDecorator</w:t>
+      </w:r>
+      <w:proofErr w:type="spellEnd"/>
+    </w:p>
+    <w:p>
+      <w:r>
+        <w:t xml:space="preserve">Strategy: </w:t>
+      </w:r>
+    </w:p>
+    <w:p>
+      <w:pPr>
+        <w:numPr>
+          <w:ilvl w:val="0"/>
+          <w:numId w:val="4"/>
+        </w:numPr>
+      </w:pPr>
+      <w:r>
+        <w:t>Context: Trip</w:t>
+      </w:r>
+    </w:p>
+    <w:p>
+      <w:pPr>
+        <w:numPr>
+          <w:ilvl w:val="0"/>
+          <w:numId w:val="4"/>
+        </w:numPr>
+      </w:pPr>
+      <w:r>
+        <w:t xml:space="preserve">Strategy: </w:t>
+      </w:r>
+      <w:proofErr w:type="spellStart"/>
+      <w:r>
+        <w:t>RouteStrategy</w:t>
+      </w:r>
+      <w:proofErr w:type="spellEnd"/>
+    </w:p>
+    <w:p>
+      <w:pPr>
+        <w:numPr>
+          <w:ilvl w:val="0"/>
+          <w:numId w:val="4"/>
+        </w:numPr>
+      </w:pPr>
+      <w:proofErr w:type="spellStart"/>
+      <w:r>
+        <w:t>ConcreteStrategies</w:t>
+      </w:r>
+      <w:proofErr w:type="spellEnd"/>
+      <w:r>
+        <w:t xml:space="preserve">: </w:t>
+      </w:r>
+      <w:proofErr w:type="spellStart"/>
+      <w:r>
+        <w:t>ShortestRouteStrategy</w:t>
+      </w:r>
+      <w:proofErr w:type="spellEnd"/>
+      <w:r>
+        <w:t xml:space="preserve">, </w:t>
+      </w:r>
+      <w:proofErr w:type="spellStart"/>
+      <w:r>
+        <w:t>FastestRouteStrategy</w:t>
+      </w:r>
+      <w:proofErr w:type="spellEnd"/>
+      <w:r>
+        <w:t xml:space="preserve">, </w:t>
+      </w:r>
+      <w:proofErr w:type="spellStart"/>
+      <w:r>
+        <w:t>ScenicStrategy</w:t>
+      </w:r>
+      <w:proofErr w:type="spellEnd"/>
+    </w:p>
+    <w:p>
+      <w:proofErr w:type="spellStart"/>
+      <w:r>
+        <w:t>AbstractFactory</w:t>
+      </w:r>
+      <w:proofErr w:type="spellEnd"/>
+    </w:p>
+    <w:p>
+      <w:pPr>
+        <w:numPr>
+          <w:ilvl w:val="0"/>
+          <w:numId w:val="5"/>
+        </w:numPr>
+      </w:pPr>
+      <w:proofErr w:type="spellStart"/>
+      <w:r>
+        <w:t>AbstractFactory</w:t>
+      </w:r>
+      <w:proofErr w:type="spellEnd"/>
+      <w:r>
+        <w:t xml:space="preserve">: </w:t>
+      </w:r>
+      <w:proofErr w:type="spellStart"/>
+      <w:r>
+        <w:t>WorldFactory</w:t>
+      </w:r>
+      <w:proofErr w:type="spellEnd"/>
+    </w:p>
+    <w:p>
+      <w:pPr>
+        <w:numPr>
+          <w:ilvl w:val="0"/>
+          <w:numId w:val="5"/>
+        </w:numPr>
+      </w:pPr>
+      <w:proofErr w:type="spellStart"/>
+      <w:r>
+        <w:t>ConcreteFactories</w:t>
+      </w:r>
+      <w:proofErr w:type="spellEnd"/>
+      <w:r>
+        <w:t xml:space="preserve">: </w:t>
+      </w:r>
+      <w:proofErr w:type="spellStart"/>
+      <w:r>
+        <w:t>DesertFactory</w:t>
+      </w:r>
+      <w:proofErr w:type="spellEnd"/>
+      <w:r>
+        <w:t xml:space="preserve">, </w:t>
+      </w:r>
+      <w:proofErr w:type="spellStart"/>
+      <w:r>
+        <w:t>SwampFactory</w:t>
+      </w:r>
+      <w:proofErr w:type="spellEnd"/>
+    </w:p>
+    <w:p>
+      <w:pPr>
+        <w:numPr>
+          <w:ilvl w:val="0"/>
+          <w:numId w:val="5"/>
+        </w:numPr>
+      </w:pPr>
+      <w:proofErr w:type="spellStart"/>
+      <w:r>
+        <w:t>AbstractProducts</w:t>
+      </w:r>
+      <w:proofErr w:type="spellEnd"/>
+      <w:r>
+        <w:t xml:space="preserve">: </w:t>
+      </w:r>
+      <w:proofErr w:type="spellStart"/>
+      <w:r>
+        <w:t>AbstractNPC</w:t>
+      </w:r>
+      <w:proofErr w:type="spellEnd"/>
+      <w:r>
+        <w:t xml:space="preserve">, </w:t>
+      </w:r>
+      <w:proofErr w:type="spellStart"/>
+      <w:r>
+        <w:t>AbstractTerrain</w:t>
+      </w:r>
+      <w:proofErr w:type="spellEnd"/>
+      <w:r>
+        <w:t xml:space="preserve">, </w:t>
+      </w:r>
+      <w:proofErr w:type="spellStart"/>
+      <w:r>
+        <w:t>AbstractObstacle</w:t>
+      </w:r>
+      <w:proofErr w:type="spellEnd"/>
+    </w:p>
+    <w:p>
+      <w:r>
+        <w:t>State:</w:t>
+      </w:r>
+    </w:p>
+    <w:p>
+      <w:pPr>
+        <w:numPr>
+          <w:ilvl w:val="0"/>
+          <w:numId w:val="6"/>
+        </w:numPr>
+      </w:pPr>
+      <w:r>
+        <w:t>Context: Traveler</w:t>
+      </w:r>
+    </w:p>
+    <w:p>
+      <w:pPr>
+        <w:numPr>
+          <w:ilvl w:val="0"/>
+          <w:numId w:val="6"/>
+        </w:numPr>
+      </w:pPr>
+      <w:r>
+        <w:t xml:space="preserve">State: </w:t>
+      </w:r>
+      <w:proofErr w:type="spellStart"/>
+      <w:r>
+        <w:t>TravelMode</w:t>
+      </w:r>
+      <w:proofErr w:type="spellEnd"/>
+    </w:p>
+    <w:p>
+      <w:pPr>
+        <w:numPr>
+          <w:ilvl w:val="0"/>
+          <w:numId w:val="6"/>
+        </w:numPr>
+      </w:pPr>
+      <w:proofErr w:type="spellStart"/>
+      <w:r>
+        <w:t>ConcreteStates</w:t>
+      </w:r>
+      <w:proofErr w:type="spellEnd"/>
+      <w:r>
+        <w:t xml:space="preserve">: </w:t>
+      </w:r>
+      <w:proofErr w:type="spellStart"/>
+      <w:r>
+        <w:t>WalkingMode</w:t>
+      </w:r>
+      <w:proofErr w:type="spellEnd"/>
+      <w:r>
+        <w:t xml:space="preserve">, </w:t>
+      </w:r>
+      <w:proofErr w:type="spellStart"/>
+      <w:r>
+        <w:t>DrivingMode</w:t>
+      </w:r>
+      <w:proofErr w:type="spellEnd"/>
+      <w:r>
+        <w:t xml:space="preserve">, </w:t>
+      </w:r>
+      <w:proofErr w:type="spellStart"/>
+      <w:r>
+        <w:t>FlyingMode</w:t>
+      </w:r>
+      <w:proofErr w:type="spellEnd"/>
+      <w:r>
+        <w:t xml:space="preserve">, </w:t>
+      </w:r>
+      <w:proofErr w:type="spellStart"/>
+      <w:r>
+        <w:t>SwimmingMode</w:t>
+      </w:r>
+      <w:proofErr w:type="spellEnd"/>
+    </w:p>
+    <w:p>
+      <w:pPr>
+        <w:rPr>
+          <w:u w:val="single"/>
+        </w:rPr>
+      </w:pPr>
+      <w:r>
+        <w:rPr>
+          <w:u w:val="single"/>
+        </w:rPr>
+        <w:t>Abstraction/Ownership Design Justification</w:t>
+      </w:r>
+    </w:p>
+    <w:p>
+      <w:pPr>
+        <w:numPr>
+          <w:ilvl w:val="0"/>
+          <w:numId w:val="7"/>
+        </w:numPr>
+      </w:pPr>
+      <w:r>
+        <w:lastRenderedPageBreak/>
+        <w:t xml:space="preserve">Region and </w:t>
+      </w:r>
+      <w:proofErr w:type="spellStart"/>
+      <w:r>
+        <w:t>MapComponent</w:t>
+      </w:r>
+      <w:proofErr w:type="spellEnd"/>
+      <w:r>
+        <w:t>, a composition association was used because when one region is deleted, all it’s other regions/locations down the tree hierarchy chain must be deleted as well</w:t>
+      </w:r>
+    </w:p>
+    <w:p>
+      <w:r>
         <w:t>2.3)</w:t>
+      </w:r>
+    </w:p>
+    <w:p>
+      <w:r>
+        <w:t>Addition 1: A new biome (Abstract Factory)</w:t>
+      </w:r>
+    </w:p>
+    <w:p>
+      <w:pPr>
+        <w:numPr>
+          <w:ilvl w:val="0"/>
+          <w:numId w:val="7"/>
+        </w:numPr>
+      </w:pPr>
+      <w:r>
+        <w:t xml:space="preserve">Created </w:t>
+      </w:r>
+      <w:proofErr w:type="spellStart"/>
+      <w:r>
+        <w:t>VolcanoFactory</w:t>
+      </w:r>
+      <w:proofErr w:type="spellEnd"/>
+      <w:r>
+        <w:t xml:space="preserve"> which creates </w:t>
+      </w:r>
+      <w:proofErr w:type="spellStart"/>
+      <w:r>
+        <w:t>VolcanicNPC</w:t>
+      </w:r>
+      <w:proofErr w:type="spellEnd"/>
+      <w:r>
+        <w:t xml:space="preserve">, </w:t>
+      </w:r>
+      <w:proofErr w:type="spellStart"/>
+      <w:r>
+        <w:t>VolcanicTerrain</w:t>
+      </w:r>
+      <w:proofErr w:type="spellEnd"/>
+      <w:r>
+        <w:t xml:space="preserve">, </w:t>
+      </w:r>
+      <w:proofErr w:type="spellStart"/>
+      <w:r>
+        <w:t>VolcanicObstacle</w:t>
+      </w:r>
+      <w:proofErr w:type="spellEnd"/>
+    </w:p>
+    <w:p>
+      <w:r>
+        <w:t>Addition 2: A new environment decorator (Decorator)</w:t>
+      </w:r>
+    </w:p>
+    <w:p>
+      <w:pPr>
+        <w:numPr>
+          <w:ilvl w:val="0"/>
+          <w:numId w:val="7"/>
+        </w:numPr>
+      </w:pPr>
+      <w:r>
+        <w:t xml:space="preserve">Created </w:t>
+      </w:r>
+      <w:proofErr w:type="spellStart"/>
+      <w:r>
+        <w:t>RadiationDecorator</w:t>
+      </w:r>
+      <w:proofErr w:type="spellEnd"/>
+      <w:r>
+        <w:t xml:space="preserve"> which would add massive travel cost penalties</w:t>
+      </w:r>
+    </w:p>
+    <w:p>
+      <w:r>
+        <w:t xml:space="preserve">Addition 3: </w:t>
+      </w:r>
+      <w:proofErr w:type="spellStart"/>
+      <w:r>
+        <w:t>TeleportationMode</w:t>
+      </w:r>
+      <w:proofErr w:type="spellEnd"/>
+    </w:p>
+    <w:p>
+      <w:pPr>
+        <w:numPr>
+          <w:ilvl w:val="0"/>
+          <w:numId w:val="7"/>
+        </w:numPr>
+      </w:pPr>
+      <w:r>
+        <w:t>Added a fast travel teleportation mode</w:t>
       </w:r>
     </w:p>
     <w:p/>
@@ -818,6 +1562,345 @@
 <file path=word/numbering.xml><?xml version="1.0" encoding="utf-8"?>
 <w:numbering xmlns:wpc="http://schemas.microsoft.com/office/word/2010/wordprocessingCanvas" xmlns:cx="http://schemas.microsoft.com/office/drawing/2014/chartex" xmlns:cx1="http://schemas.microsoft.com/office/drawing/2015/9/8/chartex" xmlns:cx2="http://schemas.microsoft.com/office/drawing/2015/10/21/chartex" xmlns:cx3="http://schemas.microsoft.com/office/drawing/2016/5/9/chartex" xmlns:cx4="http://schemas.microsoft.com/office/drawing/2016/5/10/chartex" xmlns:cx5="http://schemas.microsoft.com/office/drawing/2016/5/11/chartex" xmlns:cx6="http://schemas.microsoft.com/office/drawing/2016/5/12/chartex" xmlns:cx7="http://schemas.microsoft.com/office/drawing/2016/5/13/chartex" xmlns:cx8="http://schemas.microsoft.com/office/drawing/2016/5/14/chartex" xmlns:mc="http://schemas.openxmlformats.org/markup-compatibility/2006" xmlns:aink="http://schemas.microsoft.com/office/drawing/2016/ink" xmlns:am3d="http://schemas.microsoft.com/office/drawing/2017/model3d" xmlns:o="urn:schemas-microsoft-com:office:office" xmlns:oel="http://schemas.microsoft.com/office/2019/extlst" xmlns:r="http://schemas.openxmlformats.org/officeDocument/2006/relationships" xmlns:m="http://schemas.openxmlformats.org/officeDocument/2006/math" xmlns:v="urn:schemas-microsoft-com:vml" xmlns:wp14="http://schemas.microsoft.com/office/word/2010/wordprocessingDrawing" xmlns:wp="http://schemas.openxmlformats.org/drawingml/2006/wordprocessingDrawing" xmlns:w10="urn:schemas-microsoft-com:office:word" xmlns:w="http://schemas.openxmlformats.org/wordprocessingml/2006/main" xmlns:w14="http://schemas.microsoft.com/office/word/2010/wordml" xmlns:w15="http://schemas.microsoft.com/office/word/2012/wordml" xmlns:w16cex="http://schemas.microsoft.com/office/word/2018/wordml/cex" xmlns:w16cid="http://schemas.microsoft.com/office/word/2016/wordml/cid" xmlns:w16="http://schemas.microsoft.com/office/word/2018/wordml" xmlns:w16du="http://schemas.microsoft.com/office/word/2023/wordml/word16du" xmlns:w16sdtdh="http://schemas.microsoft.com/office/word/2020/wordml/sdtdatahash" xmlns:w16sdtfl="http://schemas.microsoft.com/office/word/2024/wordml/sdtformatlock" xmlns:w16se="http://schemas.microsoft.com/office/word/2015/wordml/symex" xmlns:wpg="http://schemas.microsoft.com/office/word/2010/wordprocessingGroup" xmlns:wpi="http://schemas.microsoft.com/office/word/2010/wordprocessingInk" xmlns:wne="http://schemas.microsoft.com/office/word/2006/wordml" xmlns:wps="http://schemas.microsoft.com/office/word/2010/wordprocessingShape" mc:Ignorable="w14 w15 w16se w16cid w16 w16cex w16sdtdh w16sdtfl w16du wp14">
   <w:abstractNum w:abstractNumId="0" w15:restartNumberingAfterBreak="0">
+    <w:nsid w:val="022C0A98"/>
+    <w:multiLevelType w:val="hybridMultilevel"/>
+    <w:tmpl w:val="2FA66CA4"/>
+    <w:lvl w:ilvl="0" w:tplc="1C090001">
+      <w:start w:val="1"/>
+      <w:numFmt w:val="bullet"/>
+      <w:lvlText w:val=""/>
+      <w:lvlJc w:val="left"/>
+      <w:pPr>
+        <w:ind w:left="720" w:hanging="360"/>
+      </w:pPr>
+      <w:rPr>
+        <w:rFonts w:ascii="Symbol" w:hAnsi="Symbol" w:hint="default"/>
+      </w:rPr>
+    </w:lvl>
+    <w:lvl w:ilvl="1" w:tplc="1C090003">
+      <w:start w:val="1"/>
+      <w:numFmt w:val="bullet"/>
+      <w:lvlText w:val="o"/>
+      <w:lvlJc w:val="left"/>
+      <w:pPr>
+        <w:ind w:left="1440" w:hanging="360"/>
+      </w:pPr>
+      <w:rPr>
+        <w:rFonts w:ascii="Courier New" w:hAnsi="Courier New" w:cs="Courier New" w:hint="default"/>
+      </w:rPr>
+    </w:lvl>
+    <w:lvl w:ilvl="2" w:tplc="1C090005">
+      <w:start w:val="1"/>
+      <w:numFmt w:val="bullet"/>
+      <w:lvlText w:val=""/>
+      <w:lvlJc w:val="left"/>
+      <w:pPr>
+        <w:ind w:left="2160" w:hanging="360"/>
+      </w:pPr>
+      <w:rPr>
+        <w:rFonts w:ascii="Wingdings" w:hAnsi="Wingdings" w:hint="default"/>
+      </w:rPr>
+    </w:lvl>
+    <w:lvl w:ilvl="3" w:tplc="1C090001">
+      <w:start w:val="1"/>
+      <w:numFmt w:val="bullet"/>
+      <w:lvlText w:val=""/>
+      <w:lvlJc w:val="left"/>
+      <w:pPr>
+        <w:ind w:left="2880" w:hanging="360"/>
+      </w:pPr>
+      <w:rPr>
+        <w:rFonts w:ascii="Symbol" w:hAnsi="Symbol" w:hint="default"/>
+      </w:rPr>
+    </w:lvl>
+    <w:lvl w:ilvl="4" w:tplc="1C090003">
+      <w:start w:val="1"/>
+      <w:numFmt w:val="bullet"/>
+      <w:lvlText w:val="o"/>
+      <w:lvlJc w:val="left"/>
+      <w:pPr>
+        <w:ind w:left="3600" w:hanging="360"/>
+      </w:pPr>
+      <w:rPr>
+        <w:rFonts w:ascii="Courier New" w:hAnsi="Courier New" w:cs="Courier New" w:hint="default"/>
+      </w:rPr>
+    </w:lvl>
+    <w:lvl w:ilvl="5" w:tplc="1C090005">
+      <w:start w:val="1"/>
+      <w:numFmt w:val="bullet"/>
+      <w:lvlText w:val=""/>
+      <w:lvlJc w:val="left"/>
+      <w:pPr>
+        <w:ind w:left="4320" w:hanging="360"/>
+      </w:pPr>
+      <w:rPr>
+        <w:rFonts w:ascii="Wingdings" w:hAnsi="Wingdings" w:hint="default"/>
+      </w:rPr>
+    </w:lvl>
+    <w:lvl w:ilvl="6" w:tplc="1C090001">
+      <w:start w:val="1"/>
+      <w:numFmt w:val="bullet"/>
+      <w:lvlText w:val=""/>
+      <w:lvlJc w:val="left"/>
+      <w:pPr>
+        <w:ind w:left="5040" w:hanging="360"/>
+      </w:pPr>
+      <w:rPr>
+        <w:rFonts w:ascii="Symbol" w:hAnsi="Symbol" w:hint="default"/>
+      </w:rPr>
+    </w:lvl>
+    <w:lvl w:ilvl="7" w:tplc="1C090003">
+      <w:start w:val="1"/>
+      <w:numFmt w:val="bullet"/>
+      <w:lvlText w:val="o"/>
+      <w:lvlJc w:val="left"/>
+      <w:pPr>
+        <w:ind w:left="5760" w:hanging="360"/>
+      </w:pPr>
+      <w:rPr>
+        <w:rFonts w:ascii="Courier New" w:hAnsi="Courier New" w:cs="Courier New" w:hint="default"/>
+      </w:rPr>
+    </w:lvl>
+    <w:lvl w:ilvl="8" w:tplc="1C090005">
+      <w:start w:val="1"/>
+      <w:numFmt w:val="bullet"/>
+      <w:lvlText w:val=""/>
+      <w:lvlJc w:val="left"/>
+      <w:pPr>
+        <w:ind w:left="6480" w:hanging="360"/>
+      </w:pPr>
+      <w:rPr>
+        <w:rFonts w:ascii="Wingdings" w:hAnsi="Wingdings" w:hint="default"/>
+      </w:rPr>
+    </w:lvl>
+  </w:abstractNum>
+  <w:abstractNum w:abstractNumId="1" w15:restartNumberingAfterBreak="0">
+    <w:nsid w:val="0DFB0481"/>
+    <w:multiLevelType w:val="hybridMultilevel"/>
+    <w:tmpl w:val="0C5EC3F2"/>
+    <w:lvl w:ilvl="0" w:tplc="1C090001">
+      <w:start w:val="1"/>
+      <w:numFmt w:val="bullet"/>
+      <w:lvlText w:val=""/>
+      <w:lvlJc w:val="left"/>
+      <w:pPr>
+        <w:ind w:left="720" w:hanging="360"/>
+      </w:pPr>
+      <w:rPr>
+        <w:rFonts w:ascii="Symbol" w:hAnsi="Symbol" w:hint="default"/>
+      </w:rPr>
+    </w:lvl>
+    <w:lvl w:ilvl="1" w:tplc="1C090003">
+      <w:start w:val="1"/>
+      <w:numFmt w:val="bullet"/>
+      <w:lvlText w:val="o"/>
+      <w:lvlJc w:val="left"/>
+      <w:pPr>
+        <w:ind w:left="1440" w:hanging="360"/>
+      </w:pPr>
+      <w:rPr>
+        <w:rFonts w:ascii="Courier New" w:hAnsi="Courier New" w:cs="Courier New" w:hint="default"/>
+      </w:rPr>
+    </w:lvl>
+    <w:lvl w:ilvl="2" w:tplc="1C090005">
+      <w:start w:val="1"/>
+      <w:numFmt w:val="bullet"/>
+      <w:lvlText w:val=""/>
+      <w:lvlJc w:val="left"/>
+      <w:pPr>
+        <w:ind w:left="2160" w:hanging="360"/>
+      </w:pPr>
+      <w:rPr>
+        <w:rFonts w:ascii="Wingdings" w:hAnsi="Wingdings" w:hint="default"/>
+      </w:rPr>
+    </w:lvl>
+    <w:lvl w:ilvl="3" w:tplc="1C090001">
+      <w:start w:val="1"/>
+      <w:numFmt w:val="bullet"/>
+      <w:lvlText w:val=""/>
+      <w:lvlJc w:val="left"/>
+      <w:pPr>
+        <w:ind w:left="2880" w:hanging="360"/>
+      </w:pPr>
+      <w:rPr>
+        <w:rFonts w:ascii="Symbol" w:hAnsi="Symbol" w:hint="default"/>
+      </w:rPr>
+    </w:lvl>
+    <w:lvl w:ilvl="4" w:tplc="1C090003">
+      <w:start w:val="1"/>
+      <w:numFmt w:val="bullet"/>
+      <w:lvlText w:val="o"/>
+      <w:lvlJc w:val="left"/>
+      <w:pPr>
+        <w:ind w:left="3600" w:hanging="360"/>
+      </w:pPr>
+      <w:rPr>
+        <w:rFonts w:ascii="Courier New" w:hAnsi="Courier New" w:cs="Courier New" w:hint="default"/>
+      </w:rPr>
+    </w:lvl>
+    <w:lvl w:ilvl="5" w:tplc="1C090005">
+      <w:start w:val="1"/>
+      <w:numFmt w:val="bullet"/>
+      <w:lvlText w:val=""/>
+      <w:lvlJc w:val="left"/>
+      <w:pPr>
+        <w:ind w:left="4320" w:hanging="360"/>
+      </w:pPr>
+      <w:rPr>
+        <w:rFonts w:ascii="Wingdings" w:hAnsi="Wingdings" w:hint="default"/>
+      </w:rPr>
+    </w:lvl>
+    <w:lvl w:ilvl="6" w:tplc="1C090001">
+      <w:start w:val="1"/>
+      <w:numFmt w:val="bullet"/>
+      <w:lvlText w:val=""/>
+      <w:lvlJc w:val="left"/>
+      <w:pPr>
+        <w:ind w:left="5040" w:hanging="360"/>
+      </w:pPr>
+      <w:rPr>
+        <w:rFonts w:ascii="Symbol" w:hAnsi="Symbol" w:hint="default"/>
+      </w:rPr>
+    </w:lvl>
+    <w:lvl w:ilvl="7" w:tplc="1C090003">
+      <w:start w:val="1"/>
+      <w:numFmt w:val="bullet"/>
+      <w:lvlText w:val="o"/>
+      <w:lvlJc w:val="left"/>
+      <w:pPr>
+        <w:ind w:left="5760" w:hanging="360"/>
+      </w:pPr>
+      <w:rPr>
+        <w:rFonts w:ascii="Courier New" w:hAnsi="Courier New" w:cs="Courier New" w:hint="default"/>
+      </w:rPr>
+    </w:lvl>
+    <w:lvl w:ilvl="8" w:tplc="1C090005">
+      <w:start w:val="1"/>
+      <w:numFmt w:val="bullet"/>
+      <w:lvlText w:val=""/>
+      <w:lvlJc w:val="left"/>
+      <w:pPr>
+        <w:ind w:left="6480" w:hanging="360"/>
+      </w:pPr>
+      <w:rPr>
+        <w:rFonts w:ascii="Wingdings" w:hAnsi="Wingdings" w:hint="default"/>
+      </w:rPr>
+    </w:lvl>
+  </w:abstractNum>
+  <w:abstractNum w:abstractNumId="2" w15:restartNumberingAfterBreak="0">
+    <w:nsid w:val="1FC15C8A"/>
+    <w:multiLevelType w:val="hybridMultilevel"/>
+    <w:tmpl w:val="BC1E4940"/>
+    <w:lvl w:ilvl="0" w:tplc="1C090001">
+      <w:start w:val="1"/>
+      <w:numFmt w:val="bullet"/>
+      <w:lvlText w:val=""/>
+      <w:lvlJc w:val="left"/>
+      <w:pPr>
+        <w:ind w:left="720" w:hanging="360"/>
+      </w:pPr>
+      <w:rPr>
+        <w:rFonts w:ascii="Symbol" w:hAnsi="Symbol" w:hint="default"/>
+      </w:rPr>
+    </w:lvl>
+    <w:lvl w:ilvl="1" w:tplc="1C090003">
+      <w:start w:val="1"/>
+      <w:numFmt w:val="bullet"/>
+      <w:lvlText w:val="o"/>
+      <w:lvlJc w:val="left"/>
+      <w:pPr>
+        <w:ind w:left="1440" w:hanging="360"/>
+      </w:pPr>
+      <w:rPr>
+        <w:rFonts w:ascii="Courier New" w:hAnsi="Courier New" w:cs="Courier New" w:hint="default"/>
+      </w:rPr>
+    </w:lvl>
+    <w:lvl w:ilvl="2" w:tplc="1C090005">
+      <w:start w:val="1"/>
+      <w:numFmt w:val="bullet"/>
+      <w:lvlText w:val=""/>
+      <w:lvlJc w:val="left"/>
+      <w:pPr>
+        <w:ind w:left="2160" w:hanging="360"/>
+      </w:pPr>
+      <w:rPr>
+        <w:rFonts w:ascii="Wingdings" w:hAnsi="Wingdings" w:hint="default"/>
+      </w:rPr>
+    </w:lvl>
+    <w:lvl w:ilvl="3" w:tplc="1C090001">
+      <w:start w:val="1"/>
+      <w:numFmt w:val="bullet"/>
+      <w:lvlText w:val=""/>
+      <w:lvlJc w:val="left"/>
+      <w:pPr>
+        <w:ind w:left="2880" w:hanging="360"/>
+      </w:pPr>
+      <w:rPr>
+        <w:rFonts w:ascii="Symbol" w:hAnsi="Symbol" w:hint="default"/>
+      </w:rPr>
+    </w:lvl>
+    <w:lvl w:ilvl="4" w:tplc="1C090003">
+      <w:start w:val="1"/>
+      <w:numFmt w:val="bullet"/>
+      <w:lvlText w:val="o"/>
+      <w:lvlJc w:val="left"/>
+      <w:pPr>
+        <w:ind w:left="3600" w:hanging="360"/>
+      </w:pPr>
+      <w:rPr>
+        <w:rFonts w:ascii="Courier New" w:hAnsi="Courier New" w:cs="Courier New" w:hint="default"/>
+      </w:rPr>
+    </w:lvl>
+    <w:lvl w:ilvl="5" w:tplc="1C090005">
+      <w:start w:val="1"/>
+      <w:numFmt w:val="bullet"/>
+      <w:lvlText w:val=""/>
+      <w:lvlJc w:val="left"/>
+      <w:pPr>
+        <w:ind w:left="4320" w:hanging="360"/>
+      </w:pPr>
+      <w:rPr>
+        <w:rFonts w:ascii="Wingdings" w:hAnsi="Wingdings" w:hint="default"/>
+      </w:rPr>
+    </w:lvl>
+    <w:lvl w:ilvl="6" w:tplc="1C090001">
+      <w:start w:val="1"/>
+      <w:numFmt w:val="bullet"/>
+      <w:lvlText w:val=""/>
+      <w:lvlJc w:val="left"/>
+      <w:pPr>
+        <w:ind w:left="5040" w:hanging="360"/>
+      </w:pPr>
+      <w:rPr>
+        <w:rFonts w:ascii="Symbol" w:hAnsi="Symbol" w:hint="default"/>
+      </w:rPr>
+    </w:lvl>
+    <w:lvl w:ilvl="7" w:tplc="1C090003">
+      <w:start w:val="1"/>
+      <w:numFmt w:val="bullet"/>
+      <w:lvlText w:val="o"/>
+      <w:lvlJc w:val="left"/>
+      <w:pPr>
+        <w:ind w:left="5760" w:hanging="360"/>
+      </w:pPr>
+      <w:rPr>
+        <w:rFonts w:ascii="Courier New" w:hAnsi="Courier New" w:cs="Courier New" w:hint="default"/>
+      </w:rPr>
+    </w:lvl>
+    <w:lvl w:ilvl="8" w:tplc="1C090005">
+      <w:start w:val="1"/>
+      <w:numFmt w:val="bullet"/>
+      <w:lvlText w:val=""/>
+      <w:lvlJc w:val="left"/>
+      <w:pPr>
+        <w:ind w:left="6480" w:hanging="360"/>
+      </w:pPr>
+      <w:rPr>
+        <w:rFonts w:ascii="Wingdings" w:hAnsi="Wingdings" w:hint="default"/>
+      </w:rPr>
+    </w:lvl>
+  </w:abstractNum>
+  <w:abstractNum w:abstractNumId="3" w15:restartNumberingAfterBreak="0">
     <w:nsid w:val="2870181E"/>
     <w:multiLevelType w:val="hybridMultilevel"/>
     <w:tmpl w:val="CD806552"/>
@@ -930,8 +2013,419 @@
       </w:rPr>
     </w:lvl>
   </w:abstractNum>
+  <w:abstractNum w:abstractNumId="4" w15:restartNumberingAfterBreak="0">
+    <w:nsid w:val="345D1475"/>
+    <w:multiLevelType w:val="hybridMultilevel"/>
+    <w:tmpl w:val="F710DF52"/>
+    <w:lvl w:ilvl="0" w:tplc="1C090001">
+      <w:start w:val="1"/>
+      <w:numFmt w:val="bullet"/>
+      <w:lvlText w:val=""/>
+      <w:lvlJc w:val="left"/>
+      <w:pPr>
+        <w:ind w:left="720" w:hanging="360"/>
+      </w:pPr>
+      <w:rPr>
+        <w:rFonts w:ascii="Symbol" w:hAnsi="Symbol" w:hint="default"/>
+      </w:rPr>
+    </w:lvl>
+    <w:lvl w:ilvl="1" w:tplc="1C090003">
+      <w:start w:val="1"/>
+      <w:numFmt w:val="bullet"/>
+      <w:lvlText w:val="o"/>
+      <w:lvlJc w:val="left"/>
+      <w:pPr>
+        <w:ind w:left="1440" w:hanging="360"/>
+      </w:pPr>
+      <w:rPr>
+        <w:rFonts w:ascii="Courier New" w:hAnsi="Courier New" w:cs="Courier New" w:hint="default"/>
+      </w:rPr>
+    </w:lvl>
+    <w:lvl w:ilvl="2" w:tplc="1C090005">
+      <w:start w:val="1"/>
+      <w:numFmt w:val="bullet"/>
+      <w:lvlText w:val=""/>
+      <w:lvlJc w:val="left"/>
+      <w:pPr>
+        <w:ind w:left="2160" w:hanging="360"/>
+      </w:pPr>
+      <w:rPr>
+        <w:rFonts w:ascii="Wingdings" w:hAnsi="Wingdings" w:hint="default"/>
+      </w:rPr>
+    </w:lvl>
+    <w:lvl w:ilvl="3" w:tplc="1C090001">
+      <w:start w:val="1"/>
+      <w:numFmt w:val="bullet"/>
+      <w:lvlText w:val=""/>
+      <w:lvlJc w:val="left"/>
+      <w:pPr>
+        <w:ind w:left="2880" w:hanging="360"/>
+      </w:pPr>
+      <w:rPr>
+        <w:rFonts w:ascii="Symbol" w:hAnsi="Symbol" w:hint="default"/>
+      </w:rPr>
+    </w:lvl>
+    <w:lvl w:ilvl="4" w:tplc="1C090003">
+      <w:start w:val="1"/>
+      <w:numFmt w:val="bullet"/>
+      <w:lvlText w:val="o"/>
+      <w:lvlJc w:val="left"/>
+      <w:pPr>
+        <w:ind w:left="3600" w:hanging="360"/>
+      </w:pPr>
+      <w:rPr>
+        <w:rFonts w:ascii="Courier New" w:hAnsi="Courier New" w:cs="Courier New" w:hint="default"/>
+      </w:rPr>
+    </w:lvl>
+    <w:lvl w:ilvl="5" w:tplc="1C090005">
+      <w:start w:val="1"/>
+      <w:numFmt w:val="bullet"/>
+      <w:lvlText w:val=""/>
+      <w:lvlJc w:val="left"/>
+      <w:pPr>
+        <w:ind w:left="4320" w:hanging="360"/>
+      </w:pPr>
+      <w:rPr>
+        <w:rFonts w:ascii="Wingdings" w:hAnsi="Wingdings" w:hint="default"/>
+      </w:rPr>
+    </w:lvl>
+    <w:lvl w:ilvl="6" w:tplc="1C090001">
+      <w:start w:val="1"/>
+      <w:numFmt w:val="bullet"/>
+      <w:lvlText w:val=""/>
+      <w:lvlJc w:val="left"/>
+      <w:pPr>
+        <w:ind w:left="5040" w:hanging="360"/>
+      </w:pPr>
+      <w:rPr>
+        <w:rFonts w:ascii="Symbol" w:hAnsi="Symbol" w:hint="default"/>
+      </w:rPr>
+    </w:lvl>
+    <w:lvl w:ilvl="7" w:tplc="1C090003">
+      <w:start w:val="1"/>
+      <w:numFmt w:val="bullet"/>
+      <w:lvlText w:val="o"/>
+      <w:lvlJc w:val="left"/>
+      <w:pPr>
+        <w:ind w:left="5760" w:hanging="360"/>
+      </w:pPr>
+      <w:rPr>
+        <w:rFonts w:ascii="Courier New" w:hAnsi="Courier New" w:cs="Courier New" w:hint="default"/>
+      </w:rPr>
+    </w:lvl>
+    <w:lvl w:ilvl="8" w:tplc="1C090005">
+      <w:start w:val="1"/>
+      <w:numFmt w:val="bullet"/>
+      <w:lvlText w:val=""/>
+      <w:lvlJc w:val="left"/>
+      <w:pPr>
+        <w:ind w:left="6480" w:hanging="360"/>
+      </w:pPr>
+      <w:rPr>
+        <w:rFonts w:ascii="Wingdings" w:hAnsi="Wingdings" w:hint="default"/>
+      </w:rPr>
+    </w:lvl>
+  </w:abstractNum>
+  <w:abstractNum w:abstractNumId="5" w15:restartNumberingAfterBreak="0">
+    <w:nsid w:val="414E1CBB"/>
+    <w:multiLevelType w:val="hybridMultilevel"/>
+    <w:tmpl w:val="67964C0A"/>
+    <w:lvl w:ilvl="0" w:tplc="1C090001">
+      <w:start w:val="1"/>
+      <w:numFmt w:val="bullet"/>
+      <w:lvlText w:val=""/>
+      <w:lvlJc w:val="left"/>
+      <w:pPr>
+        <w:ind w:left="720" w:hanging="360"/>
+      </w:pPr>
+      <w:rPr>
+        <w:rFonts w:ascii="Symbol" w:hAnsi="Symbol" w:hint="default"/>
+      </w:rPr>
+    </w:lvl>
+    <w:lvl w:ilvl="1" w:tplc="1C090003">
+      <w:start w:val="1"/>
+      <w:numFmt w:val="bullet"/>
+      <w:lvlText w:val="o"/>
+      <w:lvlJc w:val="left"/>
+      <w:pPr>
+        <w:ind w:left="1440" w:hanging="360"/>
+      </w:pPr>
+      <w:rPr>
+        <w:rFonts w:ascii="Courier New" w:hAnsi="Courier New" w:cs="Courier New" w:hint="default"/>
+      </w:rPr>
+    </w:lvl>
+    <w:lvl w:ilvl="2" w:tplc="1C090005">
+      <w:start w:val="1"/>
+      <w:numFmt w:val="bullet"/>
+      <w:lvlText w:val=""/>
+      <w:lvlJc w:val="left"/>
+      <w:pPr>
+        <w:ind w:left="2160" w:hanging="360"/>
+      </w:pPr>
+      <w:rPr>
+        <w:rFonts w:ascii="Wingdings" w:hAnsi="Wingdings" w:hint="default"/>
+      </w:rPr>
+    </w:lvl>
+    <w:lvl w:ilvl="3" w:tplc="1C090001">
+      <w:start w:val="1"/>
+      <w:numFmt w:val="bullet"/>
+      <w:lvlText w:val=""/>
+      <w:lvlJc w:val="left"/>
+      <w:pPr>
+        <w:ind w:left="2880" w:hanging="360"/>
+      </w:pPr>
+      <w:rPr>
+        <w:rFonts w:ascii="Symbol" w:hAnsi="Symbol" w:hint="default"/>
+      </w:rPr>
+    </w:lvl>
+    <w:lvl w:ilvl="4" w:tplc="1C090003">
+      <w:start w:val="1"/>
+      <w:numFmt w:val="bullet"/>
+      <w:lvlText w:val="o"/>
+      <w:lvlJc w:val="left"/>
+      <w:pPr>
+        <w:ind w:left="3600" w:hanging="360"/>
+      </w:pPr>
+      <w:rPr>
+        <w:rFonts w:ascii="Courier New" w:hAnsi="Courier New" w:cs="Courier New" w:hint="default"/>
+      </w:rPr>
+    </w:lvl>
+    <w:lvl w:ilvl="5" w:tplc="1C090005">
+      <w:start w:val="1"/>
+      <w:numFmt w:val="bullet"/>
+      <w:lvlText w:val=""/>
+      <w:lvlJc w:val="left"/>
+      <w:pPr>
+        <w:ind w:left="4320" w:hanging="360"/>
+      </w:pPr>
+      <w:rPr>
+        <w:rFonts w:ascii="Wingdings" w:hAnsi="Wingdings" w:hint="default"/>
+      </w:rPr>
+    </w:lvl>
+    <w:lvl w:ilvl="6" w:tplc="1C090001">
+      <w:start w:val="1"/>
+      <w:numFmt w:val="bullet"/>
+      <w:lvlText w:val=""/>
+      <w:lvlJc w:val="left"/>
+      <w:pPr>
+        <w:ind w:left="5040" w:hanging="360"/>
+      </w:pPr>
+      <w:rPr>
+        <w:rFonts w:ascii="Symbol" w:hAnsi="Symbol" w:hint="default"/>
+      </w:rPr>
+    </w:lvl>
+    <w:lvl w:ilvl="7" w:tplc="1C090003">
+      <w:start w:val="1"/>
+      <w:numFmt w:val="bullet"/>
+      <w:lvlText w:val="o"/>
+      <w:lvlJc w:val="left"/>
+      <w:pPr>
+        <w:ind w:left="5760" w:hanging="360"/>
+      </w:pPr>
+      <w:rPr>
+        <w:rFonts w:ascii="Courier New" w:hAnsi="Courier New" w:cs="Courier New" w:hint="default"/>
+      </w:rPr>
+    </w:lvl>
+    <w:lvl w:ilvl="8" w:tplc="1C090005">
+      <w:start w:val="1"/>
+      <w:numFmt w:val="bullet"/>
+      <w:lvlText w:val=""/>
+      <w:lvlJc w:val="left"/>
+      <w:pPr>
+        <w:ind w:left="6480" w:hanging="360"/>
+      </w:pPr>
+      <w:rPr>
+        <w:rFonts w:ascii="Wingdings" w:hAnsi="Wingdings" w:hint="default"/>
+      </w:rPr>
+    </w:lvl>
+  </w:abstractNum>
+  <w:abstractNum w:abstractNumId="6" w15:restartNumberingAfterBreak="0">
+    <w:nsid w:val="4AA679C4"/>
+    <w:multiLevelType w:val="hybridMultilevel"/>
+    <w:tmpl w:val="44F00928"/>
+    <w:lvl w:ilvl="0" w:tplc="1C090001">
+      <w:start w:val="1"/>
+      <w:numFmt w:val="bullet"/>
+      <w:lvlText w:val=""/>
+      <w:lvlJc w:val="left"/>
+      <w:pPr>
+        <w:ind w:left="720" w:hanging="360"/>
+      </w:pPr>
+      <w:rPr>
+        <w:rFonts w:ascii="Symbol" w:hAnsi="Symbol" w:hint="default"/>
+      </w:rPr>
+    </w:lvl>
+    <w:lvl w:ilvl="1" w:tplc="1C090003">
+      <w:start w:val="1"/>
+      <w:numFmt w:val="bullet"/>
+      <w:lvlText w:val="o"/>
+      <w:lvlJc w:val="left"/>
+      <w:pPr>
+        <w:ind w:left="1440" w:hanging="360"/>
+      </w:pPr>
+      <w:rPr>
+        <w:rFonts w:ascii="Courier New" w:hAnsi="Courier New" w:cs="Courier New" w:hint="default"/>
+      </w:rPr>
+    </w:lvl>
+    <w:lvl w:ilvl="2" w:tplc="1C090005">
+      <w:start w:val="1"/>
+      <w:numFmt w:val="bullet"/>
+      <w:lvlText w:val=""/>
+      <w:lvlJc w:val="left"/>
+      <w:pPr>
+        <w:ind w:left="2160" w:hanging="360"/>
+      </w:pPr>
+      <w:rPr>
+        <w:rFonts w:ascii="Wingdings" w:hAnsi="Wingdings" w:hint="default"/>
+      </w:rPr>
+    </w:lvl>
+    <w:lvl w:ilvl="3" w:tplc="1C090001">
+      <w:start w:val="1"/>
+      <w:numFmt w:val="bullet"/>
+      <w:lvlText w:val=""/>
+      <w:lvlJc w:val="left"/>
+      <w:pPr>
+        <w:ind w:left="2880" w:hanging="360"/>
+      </w:pPr>
+      <w:rPr>
+        <w:rFonts w:ascii="Symbol" w:hAnsi="Symbol" w:hint="default"/>
+      </w:rPr>
+    </w:lvl>
+    <w:lvl w:ilvl="4" w:tplc="1C090003">
+      <w:start w:val="1"/>
+      <w:numFmt w:val="bullet"/>
+      <w:lvlText w:val="o"/>
+      <w:lvlJc w:val="left"/>
+      <w:pPr>
+        <w:ind w:left="3600" w:hanging="360"/>
+      </w:pPr>
+      <w:rPr>
+        <w:rFonts w:ascii="Courier New" w:hAnsi="Courier New" w:cs="Courier New" w:hint="default"/>
+      </w:rPr>
+    </w:lvl>
+    <w:lvl w:ilvl="5" w:tplc="1C090005">
+      <w:start w:val="1"/>
+      <w:numFmt w:val="bullet"/>
+      <w:lvlText w:val=""/>
+      <w:lvlJc w:val="left"/>
+      <w:pPr>
+        <w:ind w:left="4320" w:hanging="360"/>
+      </w:pPr>
+      <w:rPr>
+        <w:rFonts w:ascii="Wingdings" w:hAnsi="Wingdings" w:hint="default"/>
+      </w:rPr>
+    </w:lvl>
+    <w:lvl w:ilvl="6" w:tplc="1C090001">
+      <w:start w:val="1"/>
+      <w:numFmt w:val="bullet"/>
+      <w:lvlText w:val=""/>
+      <w:lvlJc w:val="left"/>
+      <w:pPr>
+        <w:ind w:left="5040" w:hanging="360"/>
+      </w:pPr>
+      <w:rPr>
+        <w:rFonts w:ascii="Symbol" w:hAnsi="Symbol" w:hint="default"/>
+      </w:rPr>
+    </w:lvl>
+    <w:lvl w:ilvl="7" w:tplc="1C090003">
+      <w:start w:val="1"/>
+      <w:numFmt w:val="bullet"/>
+      <w:lvlText w:val="o"/>
+      <w:lvlJc w:val="left"/>
+      <w:pPr>
+        <w:ind w:left="5760" w:hanging="360"/>
+      </w:pPr>
+      <w:rPr>
+        <w:rFonts w:ascii="Courier New" w:hAnsi="Courier New" w:cs="Courier New" w:hint="default"/>
+      </w:rPr>
+    </w:lvl>
+    <w:lvl w:ilvl="8" w:tplc="1C090005">
+      <w:start w:val="1"/>
+      <w:numFmt w:val="bullet"/>
+      <w:lvlText w:val=""/>
+      <w:lvlJc w:val="left"/>
+      <w:pPr>
+        <w:ind w:left="6480" w:hanging="360"/>
+      </w:pPr>
+      <w:rPr>
+        <w:rFonts w:ascii="Wingdings" w:hAnsi="Wingdings" w:hint="default"/>
+      </w:rPr>
+    </w:lvl>
+  </w:abstractNum>
   <w:num w:numId="1" w16cid:durableId="1899977611">
+    <w:abstractNumId w:val="3"/>
+  </w:num>
+  <w:num w:numId="2" w16cid:durableId="1199590330">
+    <w:abstractNumId w:val="4"/>
+    <w:lvlOverride w:ilvl="0"/>
+    <w:lvlOverride w:ilvl="1"/>
+    <w:lvlOverride w:ilvl="2"/>
+    <w:lvlOverride w:ilvl="3"/>
+    <w:lvlOverride w:ilvl="4"/>
+    <w:lvlOverride w:ilvl="5"/>
+    <w:lvlOverride w:ilvl="6"/>
+    <w:lvlOverride w:ilvl="7"/>
+    <w:lvlOverride w:ilvl="8"/>
+  </w:num>
+  <w:num w:numId="3" w16cid:durableId="362173389">
+    <w:abstractNumId w:val="6"/>
+    <w:lvlOverride w:ilvl="0"/>
+    <w:lvlOverride w:ilvl="1"/>
+    <w:lvlOverride w:ilvl="2"/>
+    <w:lvlOverride w:ilvl="3"/>
+    <w:lvlOverride w:ilvl="4"/>
+    <w:lvlOverride w:ilvl="5"/>
+    <w:lvlOverride w:ilvl="6"/>
+    <w:lvlOverride w:ilvl="7"/>
+    <w:lvlOverride w:ilvl="8"/>
+  </w:num>
+  <w:num w:numId="4" w16cid:durableId="625820384">
+    <w:abstractNumId w:val="2"/>
+    <w:lvlOverride w:ilvl="0"/>
+    <w:lvlOverride w:ilvl="1"/>
+    <w:lvlOverride w:ilvl="2"/>
+    <w:lvlOverride w:ilvl="3"/>
+    <w:lvlOverride w:ilvl="4"/>
+    <w:lvlOverride w:ilvl="5"/>
+    <w:lvlOverride w:ilvl="6"/>
+    <w:lvlOverride w:ilvl="7"/>
+    <w:lvlOverride w:ilvl="8"/>
+  </w:num>
+  <w:num w:numId="5" w16cid:durableId="1243182477">
     <w:abstractNumId w:val="0"/>
+    <w:lvlOverride w:ilvl="0"/>
+    <w:lvlOverride w:ilvl="1"/>
+    <w:lvlOverride w:ilvl="2"/>
+    <w:lvlOverride w:ilvl="3"/>
+    <w:lvlOverride w:ilvl="4"/>
+    <w:lvlOverride w:ilvl="5"/>
+    <w:lvlOverride w:ilvl="6"/>
+    <w:lvlOverride w:ilvl="7"/>
+    <w:lvlOverride w:ilvl="8"/>
+  </w:num>
+  <w:num w:numId="6" w16cid:durableId="245112588">
+    <w:abstractNumId w:val="1"/>
+    <w:lvlOverride w:ilvl="0"/>
+    <w:lvlOverride w:ilvl="1"/>
+    <w:lvlOverride w:ilvl="2"/>
+    <w:lvlOverride w:ilvl="3"/>
+    <w:lvlOverride w:ilvl="4"/>
+    <w:lvlOverride w:ilvl="5"/>
+    <w:lvlOverride w:ilvl="6"/>
+    <w:lvlOverride w:ilvl="7"/>
+    <w:lvlOverride w:ilvl="8"/>
+  </w:num>
+  <w:num w:numId="7" w16cid:durableId="1756440767">
+    <w:abstractNumId w:val="5"/>
+    <w:lvlOverride w:ilvl="0"/>
+    <w:lvlOverride w:ilvl="1"/>
+    <w:lvlOverride w:ilvl="2"/>
+    <w:lvlOverride w:ilvl="3"/>
+    <w:lvlOverride w:ilvl="4"/>
+    <w:lvlOverride w:ilvl="5"/>
+    <w:lvlOverride w:ilvl="6"/>
+    <w:lvlOverride w:ilvl="7"/>
+    <w:lvlOverride w:ilvl="8"/>
   </w:num>
 </w:numbering>
 </file>

</xml_diff>

<commit_message>
Finished Task 5 and 6, added implementation for the task 7 (Abstract Factory
</commit_message>
<xml_diff>
--- a/Final PDF.docx
+++ b/Final PDF.docx
@@ -1526,6 +1526,21 @@
       <w:pPr>
         <w:pStyle w:val="Heading1"/>
       </w:pPr>
+    </w:p>
+    <w:p>
+      <w:pPr>
+        <w:pStyle w:val="Heading1"/>
+      </w:pPr>
+    </w:p>
+    <w:p>
+      <w:pPr>
+        <w:pStyle w:val="Heading1"/>
+      </w:pPr>
+    </w:p>
+    <w:p>
+      <w:pPr>
+        <w:pStyle w:val="Heading1"/>
+      </w:pPr>
       <w:r>
         <w:t>Question 5</w:t>
       </w:r>
@@ -1535,6 +1550,69 @@
         <w:t>5.2)</w:t>
       </w:r>
     </w:p>
+    <w:p>
+      <w:r>
+        <w:rPr>
+          <w:noProof/>
+        </w:rPr>
+        <w:lastRenderedPageBreak/>
+        <w:drawing>
+          <wp:anchor distT="0" distB="0" distL="114300" distR="114300" simplePos="0" relativeHeight="251658240" behindDoc="0" locked="0" layoutInCell="1" allowOverlap="1" wp14:anchorId="62F433C9" wp14:editId="12E84AF3">
+            <wp:simplePos x="0" y="0"/>
+            <wp:positionH relativeFrom="column">
+              <wp:posOffset>-556260</wp:posOffset>
+            </wp:positionH>
+            <wp:positionV relativeFrom="paragraph">
+              <wp:posOffset>0</wp:posOffset>
+            </wp:positionV>
+            <wp:extent cx="7004050" cy="3227705"/>
+            <wp:effectExtent l="0" t="0" r="6350" b="0"/>
+            <wp:wrapSquare wrapText="bothSides"/>
+            <wp:docPr id="1905266524" name="Picture 1"/>
+            <wp:cNvGraphicFramePr>
+              <a:graphicFrameLocks xmlns:a="http://schemas.openxmlformats.org/drawingml/2006/main" noChangeAspect="1"/>
+            </wp:cNvGraphicFramePr>
+            <a:graphic xmlns:a="http://schemas.openxmlformats.org/drawingml/2006/main">
+              <a:graphicData uri="http://schemas.openxmlformats.org/drawingml/2006/picture">
+                <pic:pic xmlns:pic="http://schemas.openxmlformats.org/drawingml/2006/picture">
+                  <pic:nvPicPr>
+                    <pic:cNvPr id="1905266524" name="Picture 1905266524"/>
+                    <pic:cNvPicPr/>
+                  </pic:nvPicPr>
+                  <pic:blipFill>
+                    <a:blip r:embed="rId5">
+                      <a:extLst>
+                        <a:ext uri="{28A0092B-C50C-407E-A947-70E740481C1C}">
+                          <a14:useLocalDpi xmlns:a14="http://schemas.microsoft.com/office/drawing/2010/main" val="0"/>
+                        </a:ext>
+                      </a:extLst>
+                    </a:blip>
+                    <a:stretch>
+                      <a:fillRect/>
+                    </a:stretch>
+                  </pic:blipFill>
+                  <pic:spPr>
+                    <a:xfrm>
+                      <a:off x="0" y="0"/>
+                      <a:ext cx="7004050" cy="3227705"/>
+                    </a:xfrm>
+                    <a:prstGeom prst="rect">
+                      <a:avLst/>
+                    </a:prstGeom>
+                  </pic:spPr>
+                </pic:pic>
+              </a:graphicData>
+            </a:graphic>
+            <wp14:sizeRelH relativeFrom="margin">
+              <wp14:pctWidth>0</wp14:pctWidth>
+            </wp14:sizeRelH>
+            <wp14:sizeRelV relativeFrom="margin">
+              <wp14:pctHeight>0</wp14:pctHeight>
+            </wp14:sizeRelV>
+          </wp:anchor>
+        </w:drawing>
+      </w:r>
+    </w:p>
     <w:p/>
     <w:p>
       <w:pPr>
@@ -1547,6 +1625,55 @@
     <w:p>
       <w:r>
         <w:t>6.2)</w:t>
+      </w:r>
+    </w:p>
+    <w:p/>
+    <w:p>
+      <w:r>
+        <w:rPr>
+          <w:noProof/>
+        </w:rPr>
+        <w:drawing>
+          <wp:inline distT="0" distB="0" distL="0" distR="0" wp14:anchorId="5DF70804" wp14:editId="2F1D4EF1">
+            <wp:extent cx="4392891" cy="3714689"/>
+            <wp:effectExtent l="0" t="0" r="8255" b="635"/>
+            <wp:docPr id="947160800" name="Picture 2"/>
+            <wp:cNvGraphicFramePr>
+              <a:graphicFrameLocks xmlns:a="http://schemas.openxmlformats.org/drawingml/2006/main" noChangeAspect="1"/>
+            </wp:cNvGraphicFramePr>
+            <a:graphic xmlns:a="http://schemas.openxmlformats.org/drawingml/2006/main">
+              <a:graphicData uri="http://schemas.openxmlformats.org/drawingml/2006/picture">
+                <pic:pic xmlns:pic="http://schemas.openxmlformats.org/drawingml/2006/picture">
+                  <pic:nvPicPr>
+                    <pic:cNvPr id="947160800" name="Picture 2"/>
+                    <pic:cNvPicPr/>
+                  </pic:nvPicPr>
+                  <pic:blipFill>
+                    <a:blip r:embed="rId6">
+                      <a:extLst>
+                        <a:ext uri="{28A0092B-C50C-407E-A947-70E740481C1C}">
+                          <a14:useLocalDpi xmlns:a14="http://schemas.microsoft.com/office/drawing/2010/main" val="0"/>
+                        </a:ext>
+                      </a:extLst>
+                    </a:blip>
+                    <a:stretch>
+                      <a:fillRect/>
+                    </a:stretch>
+                  </pic:blipFill>
+                  <pic:spPr>
+                    <a:xfrm>
+                      <a:off x="0" y="0"/>
+                      <a:ext cx="4408532" cy="3727915"/>
+                    </a:xfrm>
+                    <a:prstGeom prst="rect">
+                      <a:avLst/>
+                    </a:prstGeom>
+                  </pic:spPr>
+                </pic:pic>
+              </a:graphicData>
+            </a:graphic>
+          </wp:inline>
+        </w:drawing>
       </w:r>
     </w:p>
     <w:sectPr>
@@ -2357,75 +2484,21 @@
   </w:num>
   <w:num w:numId="2" w16cid:durableId="1199590330">
     <w:abstractNumId w:val="4"/>
-    <w:lvlOverride w:ilvl="0"/>
-    <w:lvlOverride w:ilvl="1"/>
-    <w:lvlOverride w:ilvl="2"/>
-    <w:lvlOverride w:ilvl="3"/>
-    <w:lvlOverride w:ilvl="4"/>
-    <w:lvlOverride w:ilvl="5"/>
-    <w:lvlOverride w:ilvl="6"/>
-    <w:lvlOverride w:ilvl="7"/>
-    <w:lvlOverride w:ilvl="8"/>
   </w:num>
   <w:num w:numId="3" w16cid:durableId="362173389">
     <w:abstractNumId w:val="6"/>
-    <w:lvlOverride w:ilvl="0"/>
-    <w:lvlOverride w:ilvl="1"/>
-    <w:lvlOverride w:ilvl="2"/>
-    <w:lvlOverride w:ilvl="3"/>
-    <w:lvlOverride w:ilvl="4"/>
-    <w:lvlOverride w:ilvl="5"/>
-    <w:lvlOverride w:ilvl="6"/>
-    <w:lvlOverride w:ilvl="7"/>
-    <w:lvlOverride w:ilvl="8"/>
   </w:num>
   <w:num w:numId="4" w16cid:durableId="625820384">
     <w:abstractNumId w:val="2"/>
-    <w:lvlOverride w:ilvl="0"/>
-    <w:lvlOverride w:ilvl="1"/>
-    <w:lvlOverride w:ilvl="2"/>
-    <w:lvlOverride w:ilvl="3"/>
-    <w:lvlOverride w:ilvl="4"/>
-    <w:lvlOverride w:ilvl="5"/>
-    <w:lvlOverride w:ilvl="6"/>
-    <w:lvlOverride w:ilvl="7"/>
-    <w:lvlOverride w:ilvl="8"/>
   </w:num>
   <w:num w:numId="5" w16cid:durableId="1243182477">
     <w:abstractNumId w:val="0"/>
-    <w:lvlOverride w:ilvl="0"/>
-    <w:lvlOverride w:ilvl="1"/>
-    <w:lvlOverride w:ilvl="2"/>
-    <w:lvlOverride w:ilvl="3"/>
-    <w:lvlOverride w:ilvl="4"/>
-    <w:lvlOverride w:ilvl="5"/>
-    <w:lvlOverride w:ilvl="6"/>
-    <w:lvlOverride w:ilvl="7"/>
-    <w:lvlOverride w:ilvl="8"/>
   </w:num>
   <w:num w:numId="6" w16cid:durableId="245112588">
     <w:abstractNumId w:val="1"/>
-    <w:lvlOverride w:ilvl="0"/>
-    <w:lvlOverride w:ilvl="1"/>
-    <w:lvlOverride w:ilvl="2"/>
-    <w:lvlOverride w:ilvl="3"/>
-    <w:lvlOverride w:ilvl="4"/>
-    <w:lvlOverride w:ilvl="5"/>
-    <w:lvlOverride w:ilvl="6"/>
-    <w:lvlOverride w:ilvl="7"/>
-    <w:lvlOverride w:ilvl="8"/>
   </w:num>
   <w:num w:numId="7" w16cid:durableId="1756440767">
     <w:abstractNumId w:val="5"/>
-    <w:lvlOverride w:ilvl="0"/>
-    <w:lvlOverride w:ilvl="1"/>
-    <w:lvlOverride w:ilvl="2"/>
-    <w:lvlOverride w:ilvl="3"/>
-    <w:lvlOverride w:ilvl="4"/>
-    <w:lvlOverride w:ilvl="5"/>
-    <w:lvlOverride w:ilvl="6"/>
-    <w:lvlOverride w:ilvl="7"/>
-    <w:lvlOverride w:ilvl="8"/>
   </w:num>
 </w:numbering>
 </file>

</xml_diff>

<commit_message>
Question 4 and PDF questions
</commit_message>
<xml_diff>
--- a/Final PDF.docx
+++ b/Final PDF.docx
@@ -1,6 +1,6 @@
 
 <file path=word/document.xml><?xml version="1.0" encoding="utf-8"?>
-<w:document xmlns:wpc="http://schemas.microsoft.com/office/word/2010/wordprocessingCanvas" xmlns:cx="http://schemas.microsoft.com/office/drawing/2014/chartex" xmlns:cx1="http://schemas.microsoft.com/office/drawing/2015/9/8/chartex" xmlns:cx2="http://schemas.microsoft.com/office/drawing/2015/10/21/chartex" xmlns:cx3="http://schemas.microsoft.com/office/drawing/2016/5/9/chartex" xmlns:cx4="http://schemas.microsoft.com/office/drawing/2016/5/10/chartex" xmlns:cx5="http://schemas.microsoft.com/office/drawing/2016/5/11/chartex" xmlns:cx6="http://schemas.microsoft.com/office/drawing/2016/5/12/chartex" xmlns:cx7="http://schemas.microsoft.com/office/drawing/2016/5/13/chartex" xmlns:cx8="http://schemas.microsoft.com/office/drawing/2016/5/14/chartex" xmlns:mc="http://schemas.openxmlformats.org/markup-compatibility/2006" xmlns:aink="http://schemas.microsoft.com/office/drawing/2016/ink" xmlns:am3d="http://schemas.microsoft.com/office/drawing/2017/model3d" xmlns:o="urn:schemas-microsoft-com:office:office" xmlns:oel="http://schemas.microsoft.com/office/2019/extlst" xmlns:r="http://schemas.openxmlformats.org/officeDocument/2006/relationships" xmlns:m="http://schemas.openxmlformats.org/officeDocument/2006/math" xmlns:v="urn:schemas-microsoft-com:vml" xmlns:wp14="http://schemas.microsoft.com/office/word/2010/wordprocessingDrawing" xmlns:wp="http://schemas.openxmlformats.org/drawingml/2006/wordprocessingDrawing" xmlns:w10="urn:schemas-microsoft-com:office:word" xmlns:w="http://schemas.openxmlformats.org/wordprocessingml/2006/main" xmlns:w14="http://schemas.microsoft.com/office/word/2010/wordml" xmlns:w15="http://schemas.microsoft.com/office/word/2012/wordml" xmlns:w16cex="http://schemas.microsoft.com/office/word/2018/wordml/cex" xmlns:w16cid="http://schemas.microsoft.com/office/word/2016/wordml/cid" xmlns:w16="http://schemas.microsoft.com/office/word/2018/wordml" xmlns:w16du="http://schemas.microsoft.com/office/word/2023/wordml/word16du" xmlns:w16sdtdh="http://schemas.microsoft.com/office/word/2020/wordml/sdtdatahash" xmlns:w16sdtfl="http://schemas.microsoft.com/office/word/2024/wordml/sdtformatlock" xmlns:w16se="http://schemas.microsoft.com/office/word/2015/wordml/symex" xmlns:wpg="http://schemas.microsoft.com/office/word/2010/wordprocessingGroup" xmlns:wpi="http://schemas.microsoft.com/office/word/2010/wordprocessingInk" xmlns:wne="http://schemas.microsoft.com/office/word/2006/wordml" xmlns:wps="http://schemas.microsoft.com/office/word/2010/wordprocessingShape" mc:Ignorable="w14 w15 w16se w16cid w16 w16cex w16sdtdh w16sdtfl w16du wp14">
+<w:document xmlns:wpc="http://schemas.microsoft.com/office/word/2010/wordprocessingCanvas" xmlns:cx="http://schemas.microsoft.com/office/drawing/2014/chartex" xmlns:cx1="http://schemas.microsoft.com/office/drawing/2015/9/8/chartex" xmlns:cx2="http://schemas.microsoft.com/office/drawing/2015/10/21/chartex" xmlns:cx3="http://schemas.microsoft.com/office/drawing/2016/5/9/chartex" xmlns:cx4="http://schemas.microsoft.com/office/drawing/2016/5/10/chartex" xmlns:cx5="http://schemas.microsoft.com/office/drawing/2016/5/11/chartex" xmlns:cx6="http://schemas.microsoft.com/office/drawing/2016/5/12/chartex" xmlns:cx7="http://schemas.microsoft.com/office/drawing/2016/5/13/chartex" xmlns:cx8="http://schemas.microsoft.com/office/drawing/2016/5/14/chartex" xmlns:mc="http://schemas.openxmlformats.org/markup-compatibility/2006" xmlns:aink="http://schemas.microsoft.com/office/drawing/2016/ink" xmlns:am3d="http://schemas.microsoft.com/office/drawing/2017/model3d" xmlns:o="urn:schemas-microsoft-com:office:office" xmlns:oel="http://schemas.microsoft.com/office/2019/extlst" xmlns:r="http://schemas.openxmlformats.org/officeDocument/2006/relationships" xmlns:m="http://schemas.openxmlformats.org/officeDocument/2006/math" xmlns:v="urn:schemas-microsoft-com:vml" xmlns:wp14="http://schemas.microsoft.com/office/word/2010/wordprocessingDrawing" xmlns:wp="http://schemas.openxmlformats.org/drawingml/2006/wordprocessingDrawing" xmlns:w10="urn:schemas-microsoft-com:office:word" xmlns:w="http://schemas.openxmlformats.org/wordprocessingml/2006/main" xmlns:w14="http://schemas.microsoft.com/office/word/2010/wordml" xmlns:w15="http://schemas.microsoft.com/office/word/2012/wordml" xmlns:w16cei="http://schemas.microsoft.com/office/word/2026/wordml/cei" xmlns:w16cex="http://schemas.microsoft.com/office/word/2018/wordml/cex" xmlns:w16cid="http://schemas.microsoft.com/office/word/2016/wordml/cid" xmlns:w16="http://schemas.microsoft.com/office/word/2018/wordml" xmlns:w16du="http://schemas.microsoft.com/office/word/2023/wordml/word16du" xmlns:w16sdtdh="http://schemas.microsoft.com/office/word/2020/wordml/sdtdatahash" xmlns:w16sdtfl="http://schemas.microsoft.com/office/word/2024/wordml/sdtformatlock" xmlns:w16se="http://schemas.microsoft.com/office/word/2015/wordml/symex" xmlns:wpg="http://schemas.microsoft.com/office/word/2010/wordprocessingGroup" xmlns:wpi="http://schemas.microsoft.com/office/word/2010/wordprocessingInk" xmlns:wne="http://schemas.microsoft.com/office/word/2006/wordml" xmlns:wps="http://schemas.microsoft.com/office/word/2010/wordprocessingShape" mc:Ignorable="w14 w15 w16se w16cid w16 w16cex w16sdtdh w16sdtfl w16du wp14">
   <w:body>
     <w:p>
       <w:pPr>
@@ -1492,6 +1492,7 @@
         <w:pStyle w:val="Heading1"/>
       </w:pPr>
       <w:r>
+        <w:lastRenderedPageBreak/>
         <w:t>Question 3</w:t>
       </w:r>
     </w:p>
@@ -1499,63 +1500,127 @@
       <w:r>
         <w:t>3.3)</w:t>
       </w:r>
-    </w:p>
-    <w:p>
-      <w:pPr>
-        <w:pStyle w:val="Heading1"/>
-      </w:pPr>
-    </w:p>
-    <w:p>
-      <w:pPr>
-        <w:pStyle w:val="Heading1"/>
-      </w:pPr>
-      <w:r>
-        <w:t>Question 4</w:t>
-      </w:r>
-    </w:p>
-    <w:p>
-      <w:r>
-        <w:t>4.3</w:t>
-      </w:r>
-      <w:r>
-        <w:t>)</w:t>
-      </w:r>
-    </w:p>
-    <w:p/>
-    <w:p>
-      <w:pPr>
-        <w:pStyle w:val="Heading1"/>
-      </w:pPr>
-    </w:p>
-    <w:p>
-      <w:pPr>
-        <w:pStyle w:val="Heading1"/>
-      </w:pPr>
-    </w:p>
-    <w:p>
-      <w:pPr>
-        <w:pStyle w:val="Heading1"/>
-      </w:pPr>
-    </w:p>
-    <w:p>
-      <w:pPr>
-        <w:pStyle w:val="Heading1"/>
-      </w:pPr>
-      <w:r>
-        <w:t>Question 5</w:t>
-      </w:r>
-    </w:p>
-    <w:p>
-      <w:r>
-        <w:t>5.2)</w:t>
-      </w:r>
-    </w:p>
-    <w:p>
       <w:r>
         <w:rPr>
           <w:noProof/>
         </w:rPr>
+        <w:drawing>
+          <wp:inline distT="0" distB="0" distL="0" distR="0" wp14:anchorId="35ED26AA" wp14:editId="26924DB6">
+            <wp:extent cx="5731510" cy="4702810"/>
+            <wp:effectExtent l="0" t="0" r="2540" b="2540"/>
+            <wp:docPr id="102926774" name="Picture 1"/>
+            <wp:cNvGraphicFramePr>
+              <a:graphicFrameLocks xmlns:a="http://schemas.openxmlformats.org/drawingml/2006/main" noChangeAspect="1"/>
+            </wp:cNvGraphicFramePr>
+            <a:graphic xmlns:a="http://schemas.openxmlformats.org/drawingml/2006/main">
+              <a:graphicData uri="http://schemas.openxmlformats.org/drawingml/2006/picture">
+                <pic:pic xmlns:pic="http://schemas.openxmlformats.org/drawingml/2006/picture">
+                  <pic:nvPicPr>
+                    <pic:cNvPr id="102926774" name="Picture 102926774"/>
+                    <pic:cNvPicPr/>
+                  </pic:nvPicPr>
+                  <pic:blipFill>
+                    <a:blip r:embed="rId5">
+                      <a:extLst>
+                        <a:ext uri="{28A0092B-C50C-407E-A947-70E740481C1C}">
+                          <a14:useLocalDpi xmlns:a14="http://schemas.microsoft.com/office/drawing/2010/main" val="0"/>
+                        </a:ext>
+                      </a:extLst>
+                    </a:blip>
+                    <a:stretch>
+                      <a:fillRect/>
+                    </a:stretch>
+                  </pic:blipFill>
+                  <pic:spPr>
+                    <a:xfrm>
+                      <a:off x="0" y="0"/>
+                      <a:ext cx="5731510" cy="4702810"/>
+                    </a:xfrm>
+                    <a:prstGeom prst="rect">
+                      <a:avLst/>
+                    </a:prstGeom>
+                  </pic:spPr>
+                </pic:pic>
+              </a:graphicData>
+            </a:graphic>
+          </wp:inline>
+        </w:drawing>
+      </w:r>
+    </w:p>
+    <w:p/>
+    <w:p>
+      <w:pPr>
+        <w:pStyle w:val="Heading1"/>
+      </w:pPr>
+      <w:r>
+        <w:t>Question 4</w:t>
+      </w:r>
+    </w:p>
+    <w:p>
+      <w:r>
+        <w:t>4.3</w:t>
+      </w:r>
+      <w:r>
+        <w:t>)</w:t>
+      </w:r>
+      <w:r>
+        <w:t xml:space="preserve"> The intent of Strategy is to define a family of algorithms, encapsulate them and then make them interchangeable, allowing clients that use it to have varying algorithms. The intent of State is to allow an object to alter its behaviour based </w:t>
+      </w:r>
+      <w:proofErr w:type="gramStart"/>
+      <w:r>
+        <w:t>off of</w:t>
+      </w:r>
+      <w:proofErr w:type="gramEnd"/>
+      <w:r>
+        <w:t xml:space="preserve"> its internal state, as if it were changing its class.</w:t>
+      </w:r>
+      <w:r>
+        <w:t xml:space="preserve"> Strategy is used for routes because Trip needs varying route-finding methods that should be independent of Trip. </w:t>
+      </w:r>
+      <w:r>
+        <w:t xml:space="preserve">State is used for movement because Traveller changes its behaviour based </w:t>
+      </w:r>
+      <w:proofErr w:type="gramStart"/>
+      <w:r>
+        <w:t>off of</w:t>
+      </w:r>
+      <w:proofErr w:type="gramEnd"/>
+      <w:r>
+        <w:t xml:space="preserve"> its current mode (of which is also changed in correlation to the internal state of Traveller). Strategy chooses the algorithm manually while State changes behaviour based on the object’s current internal state.</w:t>
+      </w:r>
+    </w:p>
+    <w:p>
+      <w:pPr>
+        <w:rPr>
+          <w:rFonts w:asciiTheme="majorHAnsi" w:eastAsiaTheme="majorEastAsia" w:hAnsiTheme="majorHAnsi" w:cstheme="majorBidi"/>
+          <w:color w:val="0F4761" w:themeColor="accent1" w:themeShade="BF"/>
+          <w:sz w:val="40"/>
+          <w:szCs w:val="40"/>
+        </w:rPr>
+      </w:pPr>
+      <w:r>
+        <w:br w:type="page"/>
+      </w:r>
+    </w:p>
+    <w:p>
+      <w:pPr>
+        <w:pStyle w:val="Heading1"/>
+      </w:pPr>
+      <w:r>
         <w:lastRenderedPageBreak/>
+        <w:t>Question 5</w:t>
+      </w:r>
+    </w:p>
+    <w:p>
+      <w:r>
+        <w:t>5.2)</w:t>
+      </w:r>
+    </w:p>
+    <w:p>
+      <w:r>
+        <w:rPr>
+          <w:noProof/>
+        </w:rPr>
         <w:drawing>
           <wp:anchor distT="0" distB="0" distL="114300" distR="114300" simplePos="0" relativeHeight="251658240" behindDoc="0" locked="0" layoutInCell="1" allowOverlap="1" wp14:anchorId="62F433C9" wp14:editId="12E84AF3">
             <wp:simplePos x="0" y="0"/>
@@ -1580,7 +1645,7 @@
                     <pic:cNvPicPr/>
                   </pic:nvPicPr>
                   <pic:blipFill>
-                    <a:blip r:embed="rId5">
+                    <a:blip r:embed="rId6">
                       <a:extLst>
                         <a:ext uri="{28A0092B-C50C-407E-A947-70E740481C1C}">
                           <a14:useLocalDpi xmlns:a14="http://schemas.microsoft.com/office/drawing/2010/main" val="0"/>
@@ -1616,9 +1681,23 @@
     <w:p/>
     <w:p>
       <w:pPr>
+        <w:rPr>
+          <w:rFonts w:asciiTheme="majorHAnsi" w:eastAsiaTheme="majorEastAsia" w:hAnsiTheme="majorHAnsi" w:cstheme="majorBidi"/>
+          <w:color w:val="0F4761" w:themeColor="accent1" w:themeShade="BF"/>
+          <w:sz w:val="40"/>
+          <w:szCs w:val="40"/>
+        </w:rPr>
+      </w:pPr>
+      <w:r>
+        <w:br w:type="page"/>
+      </w:r>
+    </w:p>
+    <w:p>
+      <w:pPr>
         <w:pStyle w:val="Heading1"/>
       </w:pPr>
       <w:r>
+        <w:lastRenderedPageBreak/>
         <w:t>Question 6</w:t>
       </w:r>
     </w:p>
@@ -1649,7 +1728,7 @@
                     <pic:cNvPicPr/>
                   </pic:nvPicPr>
                   <pic:blipFill>
-                    <a:blip r:embed="rId6">
+                    <a:blip r:embed="rId7">
                       <a:extLst>
                         <a:ext uri="{28A0092B-C50C-407E-A947-70E740481C1C}">
                           <a14:useLocalDpi xmlns:a14="http://schemas.microsoft.com/office/drawing/2010/main" val="0"/>
@@ -1687,7 +1766,7 @@
 </file>
 
 <file path=word/numbering.xml><?xml version="1.0" encoding="utf-8"?>
-<w:numbering xmlns:wpc="http://schemas.microsoft.com/office/word/2010/wordprocessingCanvas" xmlns:cx="http://schemas.microsoft.com/office/drawing/2014/chartex" xmlns:cx1="http://schemas.microsoft.com/office/drawing/2015/9/8/chartex" xmlns:cx2="http://schemas.microsoft.com/office/drawing/2015/10/21/chartex" xmlns:cx3="http://schemas.microsoft.com/office/drawing/2016/5/9/chartex" xmlns:cx4="http://schemas.microsoft.com/office/drawing/2016/5/10/chartex" xmlns:cx5="http://schemas.microsoft.com/office/drawing/2016/5/11/chartex" xmlns:cx6="http://schemas.microsoft.com/office/drawing/2016/5/12/chartex" xmlns:cx7="http://schemas.microsoft.com/office/drawing/2016/5/13/chartex" xmlns:cx8="http://schemas.microsoft.com/office/drawing/2016/5/14/chartex" xmlns:mc="http://schemas.openxmlformats.org/markup-compatibility/2006" xmlns:aink="http://schemas.microsoft.com/office/drawing/2016/ink" xmlns:am3d="http://schemas.microsoft.com/office/drawing/2017/model3d" xmlns:o="urn:schemas-microsoft-com:office:office" xmlns:oel="http://schemas.microsoft.com/office/2019/extlst" xmlns:r="http://schemas.openxmlformats.org/officeDocument/2006/relationships" xmlns:m="http://schemas.openxmlformats.org/officeDocument/2006/math" xmlns:v="urn:schemas-microsoft-com:vml" xmlns:wp14="http://schemas.microsoft.com/office/word/2010/wordprocessingDrawing" xmlns:wp="http://schemas.openxmlformats.org/drawingml/2006/wordprocessingDrawing" xmlns:w10="urn:schemas-microsoft-com:office:word" xmlns:w="http://schemas.openxmlformats.org/wordprocessingml/2006/main" xmlns:w14="http://schemas.microsoft.com/office/word/2010/wordml" xmlns:w15="http://schemas.microsoft.com/office/word/2012/wordml" xmlns:w16cex="http://schemas.microsoft.com/office/word/2018/wordml/cex" xmlns:w16cid="http://schemas.microsoft.com/office/word/2016/wordml/cid" xmlns:w16="http://schemas.microsoft.com/office/word/2018/wordml" xmlns:w16du="http://schemas.microsoft.com/office/word/2023/wordml/word16du" xmlns:w16sdtdh="http://schemas.microsoft.com/office/word/2020/wordml/sdtdatahash" xmlns:w16sdtfl="http://schemas.microsoft.com/office/word/2024/wordml/sdtformatlock" xmlns:w16se="http://schemas.microsoft.com/office/word/2015/wordml/symex" xmlns:wpg="http://schemas.microsoft.com/office/word/2010/wordprocessingGroup" xmlns:wpi="http://schemas.microsoft.com/office/word/2010/wordprocessingInk" xmlns:wne="http://schemas.microsoft.com/office/word/2006/wordml" xmlns:wps="http://schemas.microsoft.com/office/word/2010/wordprocessingShape" mc:Ignorable="w14 w15 w16se w16cid w16 w16cex w16sdtdh w16sdtfl w16du wp14">
+<w:numbering xmlns:wpc="http://schemas.microsoft.com/office/word/2010/wordprocessingCanvas" xmlns:cx="http://schemas.microsoft.com/office/drawing/2014/chartex" xmlns:cx1="http://schemas.microsoft.com/office/drawing/2015/9/8/chartex" xmlns:cx2="http://schemas.microsoft.com/office/drawing/2015/10/21/chartex" xmlns:cx3="http://schemas.microsoft.com/office/drawing/2016/5/9/chartex" xmlns:cx4="http://schemas.microsoft.com/office/drawing/2016/5/10/chartex" xmlns:cx5="http://schemas.microsoft.com/office/drawing/2016/5/11/chartex" xmlns:cx6="http://schemas.microsoft.com/office/drawing/2016/5/12/chartex" xmlns:cx7="http://schemas.microsoft.com/office/drawing/2016/5/13/chartex" xmlns:cx8="http://schemas.microsoft.com/office/drawing/2016/5/14/chartex" xmlns:mc="http://schemas.openxmlformats.org/markup-compatibility/2006" xmlns:aink="http://schemas.microsoft.com/office/drawing/2016/ink" xmlns:am3d="http://schemas.microsoft.com/office/drawing/2017/model3d" xmlns:o="urn:schemas-microsoft-com:office:office" xmlns:oel="http://schemas.microsoft.com/office/2019/extlst" xmlns:r="http://schemas.openxmlformats.org/officeDocument/2006/relationships" xmlns:m="http://schemas.openxmlformats.org/officeDocument/2006/math" xmlns:v="urn:schemas-microsoft-com:vml" xmlns:wp14="http://schemas.microsoft.com/office/word/2010/wordprocessingDrawing" xmlns:wp="http://schemas.openxmlformats.org/drawingml/2006/wordprocessingDrawing" xmlns:w10="urn:schemas-microsoft-com:office:word" xmlns:w="http://schemas.openxmlformats.org/wordprocessingml/2006/main" xmlns:w14="http://schemas.microsoft.com/office/word/2010/wordml" xmlns:w15="http://schemas.microsoft.com/office/word/2012/wordml" xmlns:w16cei="http://schemas.microsoft.com/office/word/2026/wordml/cei" xmlns:w16cex="http://schemas.microsoft.com/office/word/2018/wordml/cex" xmlns:w16cid="http://schemas.microsoft.com/office/word/2016/wordml/cid" xmlns:w16="http://schemas.microsoft.com/office/word/2018/wordml" xmlns:w16du="http://schemas.microsoft.com/office/word/2023/wordml/word16du" xmlns:w16sdtdh="http://schemas.microsoft.com/office/word/2020/wordml/sdtdatahash" xmlns:w16sdtfl="http://schemas.microsoft.com/office/word/2024/wordml/sdtformatlock" xmlns:w16se="http://schemas.microsoft.com/office/word/2015/wordml/symex" xmlns:wpg="http://schemas.microsoft.com/office/word/2010/wordprocessingGroup" xmlns:wpi="http://schemas.microsoft.com/office/word/2010/wordprocessingInk" xmlns:wne="http://schemas.microsoft.com/office/word/2006/wordml" xmlns:wps="http://schemas.microsoft.com/office/word/2010/wordprocessingShape" mc:Ignorable="w14 w15 w16se w16cid w16 w16cex w16sdtdh w16sdtfl w16du wp14">
   <w:abstractNum w:abstractNumId="0" w15:restartNumberingAfterBreak="0">
     <w:nsid w:val="022C0A98"/>
     <w:multiLevelType w:val="hybridMultilevel"/>
@@ -3106,6 +3185,7 @@
   <w:style w:type="character" w:default="1" w:styleId="DefaultParagraphFont">
     <w:name w:val="Default Paragraph Font"/>
     <w:uiPriority w:val="1"/>
+    <w:semiHidden/>
     <w:unhideWhenUsed/>
   </w:style>
   <w:style w:type="table" w:default="1" w:styleId="TableNormal">

</xml_diff>

<commit_message>
Fixed a few things, but it should work now
</commit_message>
<xml_diff>
--- a/Final PDF.docx
+++ b/Final PDF.docx
@@ -982,9 +982,70 @@
     </w:p>
     <w:p>
       <w:r>
+        <w:rPr>
+          <w:noProof/>
+        </w:rPr>
+        <w:drawing>
+          <wp:anchor distT="0" distB="0" distL="114300" distR="114300" simplePos="0" relativeHeight="251659264" behindDoc="0" locked="0" layoutInCell="1" allowOverlap="1" wp14:anchorId="037BCEC1" wp14:editId="27D9E543">
+            <wp:simplePos x="0" y="0"/>
+            <wp:positionH relativeFrom="column">
+              <wp:posOffset>-742950</wp:posOffset>
+            </wp:positionH>
+            <wp:positionV relativeFrom="paragraph">
+              <wp:posOffset>313690</wp:posOffset>
+            </wp:positionV>
+            <wp:extent cx="7184390" cy="2628900"/>
+            <wp:effectExtent l="0" t="0" r="0" b="0"/>
+            <wp:wrapSquare wrapText="bothSides"/>
+            <wp:docPr id="1739789103" name="Picture 1"/>
+            <wp:cNvGraphicFramePr>
+              <a:graphicFrameLocks xmlns:a="http://schemas.openxmlformats.org/drawingml/2006/main" noChangeAspect="1"/>
+            </wp:cNvGraphicFramePr>
+            <a:graphic xmlns:a="http://schemas.openxmlformats.org/drawingml/2006/main">
+              <a:graphicData uri="http://schemas.openxmlformats.org/drawingml/2006/picture">
+                <pic:pic xmlns:pic="http://schemas.openxmlformats.org/drawingml/2006/picture">
+                  <pic:nvPicPr>
+                    <pic:cNvPr id="1739789103" name="Picture 1739789103"/>
+                    <pic:cNvPicPr/>
+                  </pic:nvPicPr>
+                  <pic:blipFill>
+                    <a:blip r:embed="rId5" cstate="print">
+                      <a:extLst>
+                        <a:ext uri="{28A0092B-C50C-407E-A947-70E740481C1C}">
+                          <a14:useLocalDpi xmlns:a14="http://schemas.microsoft.com/office/drawing/2010/main" val="0"/>
+                        </a:ext>
+                      </a:extLst>
+                    </a:blip>
+                    <a:stretch>
+                      <a:fillRect/>
+                    </a:stretch>
+                  </pic:blipFill>
+                  <pic:spPr>
+                    <a:xfrm>
+                      <a:off x="0" y="0"/>
+                      <a:ext cx="7184390" cy="2628900"/>
+                    </a:xfrm>
+                    <a:prstGeom prst="rect">
+                      <a:avLst/>
+                    </a:prstGeom>
+                  </pic:spPr>
+                </pic:pic>
+              </a:graphicData>
+            </a:graphic>
+            <wp14:sizeRelH relativeFrom="margin">
+              <wp14:pctWidth>0</wp14:pctWidth>
+            </wp14:sizeRelH>
+            <wp14:sizeRelV relativeFrom="margin">
+              <wp14:pctHeight>0</wp14:pctHeight>
+            </wp14:sizeRelV>
+          </wp:anchor>
+        </w:drawing>
+      </w:r>
+      <w:r>
         <w:t>2.1)</w:t>
       </w:r>
     </w:p>
+    <w:p/>
     <w:p>
       <w:r>
         <w:t>2.2)</w:t>
@@ -1203,6 +1264,7 @@
       </w:pPr>
       <w:proofErr w:type="spellStart"/>
       <w:r>
+        <w:lastRenderedPageBreak/>
         <w:t>AbstractFactory</w:t>
       </w:r>
       <w:proofErr w:type="spellEnd"/>
@@ -1379,7 +1441,6 @@
         </w:numPr>
       </w:pPr>
       <w:r>
-        <w:lastRenderedPageBreak/>
         <w:t xml:space="preserve">Region and </w:t>
       </w:r>
       <w:proofErr w:type="spellStart"/>
@@ -1520,7 +1581,7 @@
                     <pic:cNvPicPr/>
                   </pic:nvPicPr>
                   <pic:blipFill>
-                    <a:blip r:embed="rId5">
+                    <a:blip r:embed="rId6">
                       <a:extLst>
                         <a:ext uri="{28A0092B-C50C-407E-A947-70E740481C1C}">
                           <a14:useLocalDpi xmlns:a14="http://schemas.microsoft.com/office/drawing/2010/main" val="0"/>
@@ -1645,7 +1706,7 @@
                     <pic:cNvPicPr/>
                   </pic:nvPicPr>
                   <pic:blipFill>
-                    <a:blip r:embed="rId6">
+                    <a:blip r:embed="rId7">
                       <a:extLst>
                         <a:ext uri="{28A0092B-C50C-407E-A947-70E740481C1C}">
                           <a14:useLocalDpi xmlns:a14="http://schemas.microsoft.com/office/drawing/2010/main" val="0"/>
@@ -1728,7 +1789,7 @@
                     <pic:cNvPicPr/>
                   </pic:nvPicPr>
                   <pic:blipFill>
-                    <a:blip r:embed="rId7">
+                    <a:blip r:embed="rId8">
                       <a:extLst>
                         <a:ext uri="{28A0092B-C50C-407E-A947-70E740481C1C}">
                           <a14:useLocalDpi xmlns:a14="http://schemas.microsoft.com/office/drawing/2010/main" val="0"/>

</xml_diff>